<commit_message>
agregado de competencias en documento - benjamin nu
</commit_message>
<xml_diff>
--- a/Experiencia_1 - Planificación de proyecto/Actividad-1 - Autoevaluaciones_Grupo2/1.1_APT122_AutoevaluacionCompetenciasFase1 - benjamin nunez.docx
+++ b/Experiencia_1 - Planificación de proyecto/Actividad-1 - Autoevaluaciones_Grupo2/1.1_APT122_AutoevaluacionCompetenciasFase1 - benjamin nunez.docx
@@ -191,25 +191,7 @@
           <w:sz w:val="24"/>
           <w:szCs w:val="24"/>
         </w:rPr>
-        <w:t xml:space="preserve">Piensa en tu proceso de aprendizaje durante el tiempo que has </w:t>
-      </w:r>
-      <w:proofErr w:type="gramStart"/>
-      <w:r>
-        <w:rPr>
-          <w:rFonts w:eastAsiaTheme="majorEastAsia"/>
-          <w:sz w:val="24"/>
-          <w:szCs w:val="24"/>
-        </w:rPr>
-        <w:t>estudiando</w:t>
-      </w:r>
-      <w:proofErr w:type="gramEnd"/>
-      <w:r>
-        <w:rPr>
-          <w:rFonts w:eastAsiaTheme="majorEastAsia"/>
-          <w:sz w:val="24"/>
-          <w:szCs w:val="24"/>
-        </w:rPr>
-        <w:t xml:space="preserve"> en Duoc UC y evalúa el nivel de logro que alcanzaste en cada competencia de tu plan de estudio. </w:t>
+        <w:t xml:space="preserve">Piensa en tu proceso de aprendizaje durante el tiempo que has estudiando en Duoc UC y evalúa el nivel de logro que alcanzaste en cada competencia de tu plan de estudio. </w:t>
       </w:r>
     </w:p>
     <w:p>
@@ -798,6 +780,14 @@
               </w:rPr>
               <w:t>Escuela</w:t>
             </w:r>
+            <w:r>
+              <w:rPr>
+                <w:rFonts w:eastAsiaTheme="majorEastAsia"/>
+                <w:sz w:val="24"/>
+                <w:szCs w:val="24"/>
+              </w:rPr>
+              <w:t xml:space="preserve"> de informática y telecomunicaciones</w:t>
+            </w:r>
           </w:p>
         </w:tc>
       </w:tr>
@@ -860,7 +850,25 @@
                 <w:sz w:val="24"/>
                 <w:szCs w:val="24"/>
               </w:rPr>
-              <w:t>Benjamin Tomás Núñez Arancibia</w:t>
+              <w:t>Benjam</w:t>
+            </w:r>
+            <w:r>
+              <w:rPr>
+                <w:rFonts w:eastAsiaTheme="majorEastAsia"/>
+                <w:color w:val="767171" w:themeColor="background2" w:themeShade="80"/>
+                <w:sz w:val="24"/>
+                <w:szCs w:val="24"/>
+              </w:rPr>
+              <w:t>í</w:t>
+            </w:r>
+            <w:r>
+              <w:rPr>
+                <w:rFonts w:eastAsiaTheme="majorEastAsia"/>
+                <w:color w:val="767171" w:themeColor="background2" w:themeShade="80"/>
+                <w:sz w:val="24"/>
+                <w:szCs w:val="24"/>
+              </w:rPr>
+              <w:t>n Tomás Núñez Arancibia</w:t>
             </w:r>
           </w:p>
         </w:tc>
@@ -969,6 +977,15 @@
                 <w:szCs w:val="24"/>
               </w:rPr>
             </w:pPr>
+            <w:r>
+              <w:rPr>
+                <w:rFonts w:eastAsiaTheme="majorEastAsia"/>
+                <w:color w:val="767171" w:themeColor="background2" w:themeShade="80"/>
+                <w:sz w:val="24"/>
+                <w:szCs w:val="24"/>
+              </w:rPr>
+              <w:t xml:space="preserve">Año 2023 </w:t>
+            </w:r>
           </w:p>
         </w:tc>
       </w:tr>
@@ -1186,7 +1203,7 @@
                 <w:sz w:val="18"/>
                 <w:szCs w:val="18"/>
               </w:rPr>
-              <w:t xml:space="preserve"> Alto Dominio</w:t>
+              <w:t>Alto Dominio</w:t>
             </w:r>
           </w:p>
         </w:tc>
@@ -1197,6 +1214,7 @@
           </w:tcPr>
           <w:p>
             <w:pPr>
+              <w:jc w:val="center"/>
               <w:rPr>
                 <w:b/>
                 <w:bCs/>
@@ -1237,7 +1255,7 @@
                 <w:sz w:val="18"/>
                 <w:szCs w:val="18"/>
               </w:rPr>
-              <w:t xml:space="preserve">Dominio Insuficiente </w:t>
+              <w:t>Dominio Insuficiente</w:t>
             </w:r>
           </w:p>
         </w:tc>
@@ -1293,7 +1311,46 @@
         <w:tc>
           <w:tcPr>
             <w:tcW w:w="1931" w:type="dxa"/>
-          </w:tcPr>
+            <w:vAlign w:val="center"/>
+          </w:tcPr>
+          <w:p>
+            <w:pPr>
+              <w:jc w:val="center"/>
+              <w:rPr>
+                <w:b/>
+                <w:bCs/>
+                <w:sz w:val="18"/>
+                <w:szCs w:val="18"/>
+              </w:rPr>
+            </w:pPr>
+            <w:r>
+              <w:rPr>
+                <w:b/>
+                <w:bCs/>
+                <w:sz w:val="18"/>
+                <w:szCs w:val="18"/>
+              </w:rPr>
+              <w:t xml:space="preserve">Ofrecer propuestas de solución informática analizando de forma integral los procesos </w:t>
+            </w:r>
+            <w:r>
+              <w:rPr>
+                <w:b/>
+                <w:bCs/>
+                <w:sz w:val="18"/>
+                <w:szCs w:val="18"/>
+              </w:rPr>
+              <w:t>de acuerdo con</w:t>
+            </w:r>
+            <w:r>
+              <w:rPr>
+                <w:b/>
+                <w:bCs/>
+                <w:sz w:val="18"/>
+                <w:szCs w:val="18"/>
+              </w:rPr>
+              <w:t xml:space="preserve"> los</w:t>
+            </w:r>
+          </w:p>
           <w:p>
             <w:pPr>
               <w:jc w:val="center"/>
@@ -1305,11 +1362,21 @@
                 <w:szCs w:val="18"/>
               </w:rPr>
             </w:pPr>
+            <w:r>
+              <w:rPr>
+                <w:b/>
+                <w:bCs/>
+                <w:sz w:val="18"/>
+                <w:szCs w:val="18"/>
+              </w:rPr>
+              <w:t>requerimientos de la organización.</w:t>
+            </w:r>
           </w:p>
         </w:tc>
         <w:tc>
           <w:tcPr>
             <w:tcW w:w="1017" w:type="dxa"/>
+            <w:vAlign w:val="center"/>
           </w:tcPr>
           <w:p>
             <w:pPr>
@@ -1326,6 +1393,7 @@
         <w:tc>
           <w:tcPr>
             <w:tcW w:w="926" w:type="dxa"/>
+            <w:vAlign w:val="center"/>
           </w:tcPr>
           <w:p>
             <w:pPr>
@@ -1342,6 +1410,7 @@
         <w:tc>
           <w:tcPr>
             <w:tcW w:w="1055" w:type="dxa"/>
+            <w:vAlign w:val="center"/>
           </w:tcPr>
           <w:p>
             <w:pPr>
@@ -1358,6 +1427,7 @@
         <w:tc>
           <w:tcPr>
             <w:tcW w:w="1187" w:type="dxa"/>
+            <w:vAlign w:val="center"/>
           </w:tcPr>
           <w:p>
             <w:pPr>
@@ -1374,6 +1444,7 @@
         <w:tc>
           <w:tcPr>
             <w:tcW w:w="1250" w:type="dxa"/>
+            <w:vAlign w:val="center"/>
           </w:tcPr>
           <w:p>
             <w:pPr>
@@ -1390,6 +1461,7 @@
         <w:tc>
           <w:tcPr>
             <w:tcW w:w="2557" w:type="dxa"/>
+            <w:vAlign w:val="center"/>
           </w:tcPr>
           <w:p>
             <w:pPr>
@@ -1412,6 +1484,7 @@
         <w:tc>
           <w:tcPr>
             <w:tcW w:w="1931" w:type="dxa"/>
+            <w:vAlign w:val="center"/>
           </w:tcPr>
           <w:p>
             <w:pPr>
@@ -1424,11 +1497,21 @@
                 <w:szCs w:val="18"/>
               </w:rPr>
             </w:pPr>
+            <w:r>
+              <w:rPr>
+                <w:b/>
+                <w:bCs/>
+                <w:sz w:val="18"/>
+                <w:szCs w:val="18"/>
+              </w:rPr>
+              <w:t>Desarrollar una solución de software utilizando técnicas que permitan sistematizar el proceso de desarrollo y mantenimiento, asegurando el logro de los objetivos.</w:t>
+            </w:r>
           </w:p>
         </w:tc>
         <w:tc>
           <w:tcPr>
             <w:tcW w:w="1017" w:type="dxa"/>
+            <w:vAlign w:val="center"/>
           </w:tcPr>
           <w:p>
             <w:pPr>
@@ -1445,6 +1528,7 @@
         <w:tc>
           <w:tcPr>
             <w:tcW w:w="926" w:type="dxa"/>
+            <w:vAlign w:val="center"/>
           </w:tcPr>
           <w:p>
             <w:pPr>
@@ -1461,6 +1545,7 @@
         <w:tc>
           <w:tcPr>
             <w:tcW w:w="1055" w:type="dxa"/>
+            <w:vAlign w:val="center"/>
           </w:tcPr>
           <w:p>
             <w:pPr>
@@ -1477,6 +1562,7 @@
         <w:tc>
           <w:tcPr>
             <w:tcW w:w="1187" w:type="dxa"/>
+            <w:vAlign w:val="center"/>
           </w:tcPr>
           <w:p>
             <w:pPr>
@@ -1493,6 +1579,7 @@
         <w:tc>
           <w:tcPr>
             <w:tcW w:w="1250" w:type="dxa"/>
+            <w:vAlign w:val="center"/>
           </w:tcPr>
           <w:p>
             <w:pPr>
@@ -1509,6 +1596,7 @@
         <w:tc>
           <w:tcPr>
             <w:tcW w:w="2557" w:type="dxa"/>
+            <w:vAlign w:val="center"/>
           </w:tcPr>
           <w:p>
             <w:pPr>
@@ -1531,22 +1619,33 @@
         <w:tc>
           <w:tcPr>
             <w:tcW w:w="1931" w:type="dxa"/>
-          </w:tcPr>
-          <w:p>
-            <w:pPr>
-              <w:jc w:val="center"/>
-              <w:rPr>
-                <w:b/>
-                <w:bCs/>
-                <w:sz w:val="18"/>
-                <w:szCs w:val="18"/>
-              </w:rPr>
-            </w:pPr>
+            <w:vAlign w:val="center"/>
+          </w:tcPr>
+          <w:p>
+            <w:pPr>
+              <w:jc w:val="center"/>
+              <w:rPr>
+                <w:b/>
+                <w:bCs/>
+                <w:sz w:val="18"/>
+                <w:szCs w:val="18"/>
+              </w:rPr>
+            </w:pPr>
+            <w:r>
+              <w:rPr>
+                <w:b/>
+                <w:bCs/>
+                <w:sz w:val="18"/>
+                <w:szCs w:val="18"/>
+              </w:rPr>
+              <w:t>Construir Modelos de datos para soportar los requerimientos de la organización acuerdo a un diseño definido y escalable en el tiempo.</w:t>
+            </w:r>
           </w:p>
         </w:tc>
         <w:tc>
           <w:tcPr>
             <w:tcW w:w="1017" w:type="dxa"/>
+            <w:vAlign w:val="center"/>
           </w:tcPr>
           <w:p>
             <w:pPr>
@@ -1563,6 +1662,7 @@
         <w:tc>
           <w:tcPr>
             <w:tcW w:w="926" w:type="dxa"/>
+            <w:vAlign w:val="center"/>
           </w:tcPr>
           <w:p>
             <w:pPr>
@@ -1579,6 +1679,7 @@
         <w:tc>
           <w:tcPr>
             <w:tcW w:w="1055" w:type="dxa"/>
+            <w:vAlign w:val="center"/>
           </w:tcPr>
           <w:p>
             <w:pPr>
@@ -1595,6 +1696,7 @@
         <w:tc>
           <w:tcPr>
             <w:tcW w:w="1187" w:type="dxa"/>
+            <w:vAlign w:val="center"/>
           </w:tcPr>
           <w:p>
             <w:pPr>
@@ -1611,6 +1713,7 @@
         <w:tc>
           <w:tcPr>
             <w:tcW w:w="1250" w:type="dxa"/>
+            <w:vAlign w:val="center"/>
           </w:tcPr>
           <w:p>
             <w:pPr>
@@ -1627,6 +1730,7 @@
         <w:tc>
           <w:tcPr>
             <w:tcW w:w="2557" w:type="dxa"/>
+            <w:vAlign w:val="center"/>
           </w:tcPr>
           <w:p>
             <w:pPr>
@@ -1649,22 +1753,51 @@
         <w:tc>
           <w:tcPr>
             <w:tcW w:w="1931" w:type="dxa"/>
-          </w:tcPr>
-          <w:p>
-            <w:pPr>
-              <w:jc w:val="center"/>
-              <w:rPr>
-                <w:b/>
-                <w:bCs/>
-                <w:sz w:val="18"/>
-                <w:szCs w:val="18"/>
-              </w:rPr>
-            </w:pPr>
+            <w:vAlign w:val="center"/>
+          </w:tcPr>
+          <w:p>
+            <w:pPr>
+              <w:jc w:val="center"/>
+              <w:rPr>
+                <w:b/>
+                <w:bCs/>
+                <w:sz w:val="18"/>
+                <w:szCs w:val="18"/>
+              </w:rPr>
+            </w:pPr>
+            <w:r>
+              <w:rPr>
+                <w:b/>
+                <w:bCs/>
+                <w:sz w:val="18"/>
+                <w:szCs w:val="18"/>
+              </w:rPr>
+              <w:t xml:space="preserve">Programar consultas o rutinas para manipular información de una base de datos </w:t>
+            </w:r>
+            <w:r>
+              <w:rPr>
+                <w:b/>
+                <w:bCs/>
+                <w:sz w:val="18"/>
+                <w:szCs w:val="18"/>
+              </w:rPr>
+              <w:t>de acuerdo con</w:t>
+            </w:r>
+            <w:r>
+              <w:rPr>
+                <w:b/>
+                <w:bCs/>
+                <w:sz w:val="18"/>
+                <w:szCs w:val="18"/>
+              </w:rPr>
+              <w:t xml:space="preserve"> los requerimientos de la organización.</w:t>
+            </w:r>
           </w:p>
         </w:tc>
         <w:tc>
           <w:tcPr>
             <w:tcW w:w="1017" w:type="dxa"/>
+            <w:vAlign w:val="center"/>
           </w:tcPr>
           <w:p>
             <w:pPr>
@@ -1681,6 +1814,7 @@
         <w:tc>
           <w:tcPr>
             <w:tcW w:w="926" w:type="dxa"/>
+            <w:vAlign w:val="center"/>
           </w:tcPr>
           <w:p>
             <w:pPr>
@@ -1697,6 +1831,7 @@
         <w:tc>
           <w:tcPr>
             <w:tcW w:w="1055" w:type="dxa"/>
+            <w:vAlign w:val="center"/>
           </w:tcPr>
           <w:p>
             <w:pPr>
@@ -1713,6 +1848,7 @@
         <w:tc>
           <w:tcPr>
             <w:tcW w:w="1187" w:type="dxa"/>
+            <w:vAlign w:val="center"/>
           </w:tcPr>
           <w:p>
             <w:pPr>
@@ -1729,6 +1865,7 @@
         <w:tc>
           <w:tcPr>
             <w:tcW w:w="1250" w:type="dxa"/>
+            <w:vAlign w:val="center"/>
           </w:tcPr>
           <w:p>
             <w:pPr>
@@ -1745,6 +1882,7 @@
         <w:tc>
           <w:tcPr>
             <w:tcW w:w="2557" w:type="dxa"/>
+            <w:vAlign w:val="center"/>
           </w:tcPr>
           <w:p>
             <w:pPr>
@@ -1767,22 +1905,43 @@
         <w:tc>
           <w:tcPr>
             <w:tcW w:w="1931" w:type="dxa"/>
-          </w:tcPr>
-          <w:p>
-            <w:pPr>
-              <w:jc w:val="center"/>
-              <w:rPr>
-                <w:b/>
-                <w:bCs/>
-                <w:sz w:val="18"/>
-                <w:szCs w:val="18"/>
-              </w:rPr>
-            </w:pPr>
+            <w:vAlign w:val="center"/>
+          </w:tcPr>
+          <w:p>
+            <w:pPr>
+              <w:jc w:val="center"/>
+              <w:rPr>
+                <w:b/>
+                <w:bCs/>
+                <w:sz w:val="18"/>
+                <w:szCs w:val="18"/>
+              </w:rPr>
+            </w:pPr>
+            <w:r>
+              <w:rPr>
+                <w:b/>
+                <w:bCs/>
+                <w:sz w:val="18"/>
+                <w:szCs w:val="18"/>
+              </w:rPr>
+              <w:t xml:space="preserve">Construir programas y rutinas de variada complejidad para dar solución a requerimientos de la organización, acordes a tecnologías de mercado y utilizando </w:t>
+            </w:r>
+            <w:r>
+              <w:rPr>
+                <w:b/>
+                <w:bCs/>
+                <w:sz w:val="18"/>
+                <w:szCs w:val="18"/>
+              </w:rPr>
+              <w:lastRenderedPageBreak/>
+              <w:t>buenas prácticas de codificación.</w:t>
+            </w:r>
           </w:p>
         </w:tc>
         <w:tc>
           <w:tcPr>
             <w:tcW w:w="1017" w:type="dxa"/>
+            <w:vAlign w:val="center"/>
           </w:tcPr>
           <w:p>
             <w:pPr>
@@ -1799,6 +1958,7 @@
         <w:tc>
           <w:tcPr>
             <w:tcW w:w="926" w:type="dxa"/>
+            <w:vAlign w:val="center"/>
           </w:tcPr>
           <w:p>
             <w:pPr>
@@ -1815,6 +1975,7 @@
         <w:tc>
           <w:tcPr>
             <w:tcW w:w="1055" w:type="dxa"/>
+            <w:vAlign w:val="center"/>
           </w:tcPr>
           <w:p>
             <w:pPr>
@@ -1831,6 +1992,7 @@
         <w:tc>
           <w:tcPr>
             <w:tcW w:w="1187" w:type="dxa"/>
+            <w:vAlign w:val="center"/>
           </w:tcPr>
           <w:p>
             <w:pPr>
@@ -1847,6 +2009,7 @@
         <w:tc>
           <w:tcPr>
             <w:tcW w:w="1250" w:type="dxa"/>
+            <w:vAlign w:val="center"/>
           </w:tcPr>
           <w:p>
             <w:pPr>
@@ -1863,6 +2026,7 @@
         <w:tc>
           <w:tcPr>
             <w:tcW w:w="2557" w:type="dxa"/>
+            <w:vAlign w:val="center"/>
           </w:tcPr>
           <w:p>
             <w:pPr>
@@ -1885,22 +2049,33 @@
         <w:tc>
           <w:tcPr>
             <w:tcW w:w="1931" w:type="dxa"/>
-          </w:tcPr>
-          <w:p>
-            <w:pPr>
-              <w:jc w:val="center"/>
-              <w:rPr>
-                <w:b/>
-                <w:bCs/>
-                <w:sz w:val="18"/>
-                <w:szCs w:val="18"/>
-              </w:rPr>
-            </w:pPr>
+            <w:vAlign w:val="center"/>
+          </w:tcPr>
+          <w:p>
+            <w:pPr>
+              <w:jc w:val="center"/>
+              <w:rPr>
+                <w:b/>
+                <w:bCs/>
+                <w:sz w:val="18"/>
+                <w:szCs w:val="18"/>
+              </w:rPr>
+            </w:pPr>
+            <w:r>
+              <w:rPr>
+                <w:b/>
+                <w:bCs/>
+                <w:sz w:val="18"/>
+                <w:szCs w:val="18"/>
+              </w:rPr>
+              <w:t>Realizar pruebas de certificación tanto de los productos como de los procesos utilizando buenas prácticas definidas por la industria.</w:t>
+            </w:r>
           </w:p>
         </w:tc>
         <w:tc>
           <w:tcPr>
             <w:tcW w:w="1017" w:type="dxa"/>
+            <w:vAlign w:val="center"/>
           </w:tcPr>
           <w:p>
             <w:pPr>
@@ -1917,6 +2092,7 @@
         <w:tc>
           <w:tcPr>
             <w:tcW w:w="926" w:type="dxa"/>
+            <w:vAlign w:val="center"/>
           </w:tcPr>
           <w:p>
             <w:pPr>
@@ -1933,6 +2109,7 @@
         <w:tc>
           <w:tcPr>
             <w:tcW w:w="1055" w:type="dxa"/>
+            <w:vAlign w:val="center"/>
           </w:tcPr>
           <w:p>
             <w:pPr>
@@ -1949,6 +2126,7 @@
         <w:tc>
           <w:tcPr>
             <w:tcW w:w="1187" w:type="dxa"/>
+            <w:vAlign w:val="center"/>
           </w:tcPr>
           <w:p>
             <w:pPr>
@@ -1965,6 +2143,7 @@
         <w:tc>
           <w:tcPr>
             <w:tcW w:w="1250" w:type="dxa"/>
+            <w:vAlign w:val="center"/>
           </w:tcPr>
           <w:p>
             <w:pPr>
@@ -1981,6 +2160,7 @@
         <w:tc>
           <w:tcPr>
             <w:tcW w:w="2557" w:type="dxa"/>
+            <w:vAlign w:val="center"/>
           </w:tcPr>
           <w:p>
             <w:pPr>
@@ -2003,22 +2183,33 @@
         <w:tc>
           <w:tcPr>
             <w:tcW w:w="1931" w:type="dxa"/>
-          </w:tcPr>
-          <w:p>
-            <w:pPr>
-              <w:jc w:val="center"/>
-              <w:rPr>
-                <w:b/>
-                <w:bCs/>
-                <w:sz w:val="18"/>
-                <w:szCs w:val="18"/>
-              </w:rPr>
-            </w:pPr>
+            <w:vAlign w:val="center"/>
+          </w:tcPr>
+          <w:p>
+            <w:pPr>
+              <w:jc w:val="center"/>
+              <w:rPr>
+                <w:b/>
+                <w:bCs/>
+                <w:sz w:val="18"/>
+                <w:szCs w:val="18"/>
+              </w:rPr>
+            </w:pPr>
+            <w:r>
+              <w:rPr>
+                <w:b/>
+                <w:bCs/>
+                <w:sz w:val="18"/>
+                <w:szCs w:val="18"/>
+              </w:rPr>
+              <w:t>Construir el modelo arquitectónico de una solución sistémica que soporte los procesos de negocio de acuerdo los requerimientos de la organización y estándares industria.</w:t>
+            </w:r>
           </w:p>
         </w:tc>
         <w:tc>
           <w:tcPr>
             <w:tcW w:w="1017" w:type="dxa"/>
+            <w:vAlign w:val="center"/>
           </w:tcPr>
           <w:p>
             <w:pPr>
@@ -2035,6 +2226,7 @@
         <w:tc>
           <w:tcPr>
             <w:tcW w:w="926" w:type="dxa"/>
+            <w:vAlign w:val="center"/>
           </w:tcPr>
           <w:p>
             <w:pPr>
@@ -2051,6 +2243,7 @@
         <w:tc>
           <w:tcPr>
             <w:tcW w:w="1055" w:type="dxa"/>
+            <w:vAlign w:val="center"/>
           </w:tcPr>
           <w:p>
             <w:pPr>
@@ -2067,6 +2260,7 @@
         <w:tc>
           <w:tcPr>
             <w:tcW w:w="1187" w:type="dxa"/>
+            <w:vAlign w:val="center"/>
           </w:tcPr>
           <w:p>
             <w:pPr>
@@ -2083,6 +2277,7 @@
         <w:tc>
           <w:tcPr>
             <w:tcW w:w="1250" w:type="dxa"/>
+            <w:vAlign w:val="center"/>
           </w:tcPr>
           <w:p>
             <w:pPr>
@@ -2099,6 +2294,7 @@
         <w:tc>
           <w:tcPr>
             <w:tcW w:w="2557" w:type="dxa"/>
+            <w:vAlign w:val="center"/>
           </w:tcPr>
           <w:p>
             <w:pPr>
@@ -2121,22 +2317,51 @@
         <w:tc>
           <w:tcPr>
             <w:tcW w:w="1931" w:type="dxa"/>
-          </w:tcPr>
-          <w:p>
-            <w:pPr>
-              <w:jc w:val="center"/>
-              <w:rPr>
-                <w:b/>
-                <w:bCs/>
-                <w:sz w:val="18"/>
-                <w:szCs w:val="18"/>
-              </w:rPr>
-            </w:pPr>
+            <w:vAlign w:val="center"/>
+          </w:tcPr>
+          <w:p>
+            <w:pPr>
+              <w:jc w:val="center"/>
+              <w:rPr>
+                <w:b/>
+                <w:bCs/>
+                <w:sz w:val="18"/>
+                <w:szCs w:val="18"/>
+              </w:rPr>
+            </w:pPr>
+            <w:r>
+              <w:rPr>
+                <w:b/>
+                <w:bCs/>
+                <w:sz w:val="18"/>
+                <w:szCs w:val="18"/>
+              </w:rPr>
+              <w:t xml:space="preserve">Implementar soluciones sistémicas integrales para automatizar u optimizar procesos de negocio </w:t>
+            </w:r>
+            <w:r>
+              <w:rPr>
+                <w:b/>
+                <w:bCs/>
+                <w:sz w:val="18"/>
+                <w:szCs w:val="18"/>
+              </w:rPr>
+              <w:t>de acuerdo con</w:t>
+            </w:r>
+            <w:r>
+              <w:rPr>
+                <w:b/>
+                <w:bCs/>
+                <w:sz w:val="18"/>
+                <w:szCs w:val="18"/>
+              </w:rPr>
+              <w:t xml:space="preserve"> las necesidades de la organización.</w:t>
+            </w:r>
           </w:p>
         </w:tc>
         <w:tc>
           <w:tcPr>
             <w:tcW w:w="1017" w:type="dxa"/>
+            <w:vAlign w:val="center"/>
           </w:tcPr>
           <w:p>
             <w:pPr>
@@ -2153,6 +2378,7 @@
         <w:tc>
           <w:tcPr>
             <w:tcW w:w="926" w:type="dxa"/>
+            <w:vAlign w:val="center"/>
           </w:tcPr>
           <w:p>
             <w:pPr>
@@ -2169,6 +2395,7 @@
         <w:tc>
           <w:tcPr>
             <w:tcW w:w="1055" w:type="dxa"/>
+            <w:vAlign w:val="center"/>
           </w:tcPr>
           <w:p>
             <w:pPr>
@@ -2185,6 +2412,7 @@
         <w:tc>
           <w:tcPr>
             <w:tcW w:w="1187" w:type="dxa"/>
+            <w:vAlign w:val="center"/>
           </w:tcPr>
           <w:p>
             <w:pPr>
@@ -2201,6 +2429,7 @@
         <w:tc>
           <w:tcPr>
             <w:tcW w:w="1250" w:type="dxa"/>
+            <w:vAlign w:val="center"/>
           </w:tcPr>
           <w:p>
             <w:pPr>
@@ -2217,6 +2446,1716 @@
         <w:tc>
           <w:tcPr>
             <w:tcW w:w="2557" w:type="dxa"/>
+            <w:vAlign w:val="center"/>
+          </w:tcPr>
+          <w:p>
+            <w:pPr>
+              <w:jc w:val="center"/>
+              <w:rPr>
+                <w:b/>
+                <w:bCs/>
+                <w:sz w:val="18"/>
+                <w:szCs w:val="18"/>
+              </w:rPr>
+            </w:pPr>
+          </w:p>
+        </w:tc>
+      </w:tr>
+      <w:tr>
+        <w:trPr>
+          <w:trHeight w:val="576"/>
+          <w:jc w:val="center"/>
+        </w:trPr>
+        <w:tc>
+          <w:tcPr>
+            <w:tcW w:w="1931" w:type="dxa"/>
+            <w:vAlign w:val="center"/>
+          </w:tcPr>
+          <w:p>
+            <w:pPr>
+              <w:jc w:val="center"/>
+              <w:rPr>
+                <w:b/>
+                <w:bCs/>
+                <w:sz w:val="18"/>
+                <w:szCs w:val="18"/>
+              </w:rPr>
+            </w:pPr>
+            <w:r>
+              <w:rPr>
+                <w:b/>
+                <w:bCs/>
+                <w:sz w:val="18"/>
+                <w:szCs w:val="18"/>
+              </w:rPr>
+              <w:t>Resolver las vulnerabilidades sistémicas para asegurar que el software construido cumple las normas de seguridad exigidas por la industria.</w:t>
+            </w:r>
+          </w:p>
+        </w:tc>
+        <w:tc>
+          <w:tcPr>
+            <w:tcW w:w="1017" w:type="dxa"/>
+            <w:vAlign w:val="center"/>
+          </w:tcPr>
+          <w:p>
+            <w:pPr>
+              <w:jc w:val="center"/>
+              <w:rPr>
+                <w:b/>
+                <w:bCs/>
+                <w:sz w:val="18"/>
+                <w:szCs w:val="18"/>
+              </w:rPr>
+            </w:pPr>
+          </w:p>
+        </w:tc>
+        <w:tc>
+          <w:tcPr>
+            <w:tcW w:w="926" w:type="dxa"/>
+            <w:vAlign w:val="center"/>
+          </w:tcPr>
+          <w:p>
+            <w:pPr>
+              <w:jc w:val="center"/>
+              <w:rPr>
+                <w:b/>
+                <w:bCs/>
+                <w:sz w:val="18"/>
+                <w:szCs w:val="18"/>
+              </w:rPr>
+            </w:pPr>
+          </w:p>
+        </w:tc>
+        <w:tc>
+          <w:tcPr>
+            <w:tcW w:w="1055" w:type="dxa"/>
+            <w:vAlign w:val="center"/>
+          </w:tcPr>
+          <w:p>
+            <w:pPr>
+              <w:jc w:val="center"/>
+              <w:rPr>
+                <w:b/>
+                <w:bCs/>
+                <w:sz w:val="18"/>
+                <w:szCs w:val="18"/>
+              </w:rPr>
+            </w:pPr>
+          </w:p>
+        </w:tc>
+        <w:tc>
+          <w:tcPr>
+            <w:tcW w:w="1187" w:type="dxa"/>
+            <w:vAlign w:val="center"/>
+          </w:tcPr>
+          <w:p>
+            <w:pPr>
+              <w:jc w:val="center"/>
+              <w:rPr>
+                <w:b/>
+                <w:bCs/>
+                <w:sz w:val="18"/>
+                <w:szCs w:val="18"/>
+              </w:rPr>
+            </w:pPr>
+          </w:p>
+        </w:tc>
+        <w:tc>
+          <w:tcPr>
+            <w:tcW w:w="1250" w:type="dxa"/>
+            <w:vAlign w:val="center"/>
+          </w:tcPr>
+          <w:p>
+            <w:pPr>
+              <w:jc w:val="center"/>
+              <w:rPr>
+                <w:b/>
+                <w:bCs/>
+                <w:sz w:val="18"/>
+                <w:szCs w:val="18"/>
+              </w:rPr>
+            </w:pPr>
+          </w:p>
+        </w:tc>
+        <w:tc>
+          <w:tcPr>
+            <w:tcW w:w="2557" w:type="dxa"/>
+            <w:vAlign w:val="center"/>
+          </w:tcPr>
+          <w:p>
+            <w:pPr>
+              <w:jc w:val="center"/>
+              <w:rPr>
+                <w:b/>
+                <w:bCs/>
+                <w:sz w:val="18"/>
+                <w:szCs w:val="18"/>
+              </w:rPr>
+            </w:pPr>
+          </w:p>
+        </w:tc>
+      </w:tr>
+      <w:tr>
+        <w:trPr>
+          <w:trHeight w:val="576"/>
+          <w:jc w:val="center"/>
+        </w:trPr>
+        <w:tc>
+          <w:tcPr>
+            <w:tcW w:w="1931" w:type="dxa"/>
+            <w:vAlign w:val="center"/>
+          </w:tcPr>
+          <w:p>
+            <w:pPr>
+              <w:jc w:val="center"/>
+              <w:rPr>
+                <w:b/>
+                <w:bCs/>
+                <w:sz w:val="18"/>
+                <w:szCs w:val="18"/>
+              </w:rPr>
+            </w:pPr>
+            <w:r>
+              <w:rPr>
+                <w:b/>
+                <w:bCs/>
+                <w:sz w:val="18"/>
+                <w:szCs w:val="18"/>
+              </w:rPr>
+              <w:t>Gestionar proyectos informáticos, ofreciendo alternativas para la toma de decisiones de acuerdo a los requerimientos de la organización.</w:t>
+            </w:r>
+          </w:p>
+        </w:tc>
+        <w:tc>
+          <w:tcPr>
+            <w:tcW w:w="1017" w:type="dxa"/>
+            <w:vAlign w:val="center"/>
+          </w:tcPr>
+          <w:p>
+            <w:pPr>
+              <w:jc w:val="center"/>
+              <w:rPr>
+                <w:b/>
+                <w:bCs/>
+                <w:sz w:val="18"/>
+                <w:szCs w:val="18"/>
+              </w:rPr>
+            </w:pPr>
+          </w:p>
+        </w:tc>
+        <w:tc>
+          <w:tcPr>
+            <w:tcW w:w="926" w:type="dxa"/>
+            <w:vAlign w:val="center"/>
+          </w:tcPr>
+          <w:p>
+            <w:pPr>
+              <w:jc w:val="center"/>
+              <w:rPr>
+                <w:b/>
+                <w:bCs/>
+                <w:sz w:val="18"/>
+                <w:szCs w:val="18"/>
+              </w:rPr>
+            </w:pPr>
+          </w:p>
+        </w:tc>
+        <w:tc>
+          <w:tcPr>
+            <w:tcW w:w="1055" w:type="dxa"/>
+            <w:vAlign w:val="center"/>
+          </w:tcPr>
+          <w:p>
+            <w:pPr>
+              <w:jc w:val="center"/>
+              <w:rPr>
+                <w:b/>
+                <w:bCs/>
+                <w:sz w:val="18"/>
+                <w:szCs w:val="18"/>
+              </w:rPr>
+            </w:pPr>
+          </w:p>
+        </w:tc>
+        <w:tc>
+          <w:tcPr>
+            <w:tcW w:w="1187" w:type="dxa"/>
+            <w:vAlign w:val="center"/>
+          </w:tcPr>
+          <w:p>
+            <w:pPr>
+              <w:jc w:val="center"/>
+              <w:rPr>
+                <w:b/>
+                <w:bCs/>
+                <w:sz w:val="18"/>
+                <w:szCs w:val="18"/>
+              </w:rPr>
+            </w:pPr>
+          </w:p>
+        </w:tc>
+        <w:tc>
+          <w:tcPr>
+            <w:tcW w:w="1250" w:type="dxa"/>
+            <w:vAlign w:val="center"/>
+          </w:tcPr>
+          <w:p>
+            <w:pPr>
+              <w:jc w:val="center"/>
+              <w:rPr>
+                <w:b/>
+                <w:bCs/>
+                <w:sz w:val="18"/>
+                <w:szCs w:val="18"/>
+              </w:rPr>
+            </w:pPr>
+          </w:p>
+        </w:tc>
+        <w:tc>
+          <w:tcPr>
+            <w:tcW w:w="2557" w:type="dxa"/>
+            <w:vAlign w:val="center"/>
+          </w:tcPr>
+          <w:p>
+            <w:pPr>
+              <w:jc w:val="center"/>
+              <w:rPr>
+                <w:b/>
+                <w:bCs/>
+                <w:sz w:val="18"/>
+                <w:szCs w:val="18"/>
+              </w:rPr>
+            </w:pPr>
+          </w:p>
+        </w:tc>
+      </w:tr>
+      <w:tr>
+        <w:trPr>
+          <w:trHeight w:val="576"/>
+          <w:jc w:val="center"/>
+        </w:trPr>
+        <w:tc>
+          <w:tcPr>
+            <w:tcW w:w="1931" w:type="dxa"/>
+            <w:vAlign w:val="center"/>
+          </w:tcPr>
+          <w:p>
+            <w:pPr>
+              <w:jc w:val="center"/>
+              <w:rPr>
+                <w:b/>
+                <w:bCs/>
+                <w:sz w:val="18"/>
+                <w:szCs w:val="18"/>
+              </w:rPr>
+            </w:pPr>
+            <w:r>
+              <w:rPr>
+                <w:b/>
+                <w:bCs/>
+                <w:sz w:val="18"/>
+                <w:szCs w:val="18"/>
+              </w:rPr>
+              <w:t xml:space="preserve">Desarrollar la transformación de grandes volúmenes de datos para la obtención de información y conocimiento de la organización a fin de apoyar la toma de decisiones y la mejora de los procesos de negocio, </w:t>
+            </w:r>
+            <w:r>
+              <w:rPr>
+                <w:b/>
+                <w:bCs/>
+                <w:sz w:val="18"/>
+                <w:szCs w:val="18"/>
+              </w:rPr>
+              <w:t>de acuerdo con</w:t>
+            </w:r>
+            <w:r>
+              <w:rPr>
+                <w:b/>
+                <w:bCs/>
+                <w:sz w:val="18"/>
+                <w:szCs w:val="18"/>
+              </w:rPr>
+              <w:t xml:space="preserve"> las necesidades de la organización</w:t>
+            </w:r>
+          </w:p>
+        </w:tc>
+        <w:tc>
+          <w:tcPr>
+            <w:tcW w:w="1017" w:type="dxa"/>
+            <w:vAlign w:val="center"/>
+          </w:tcPr>
+          <w:p>
+            <w:pPr>
+              <w:jc w:val="center"/>
+              <w:rPr>
+                <w:b/>
+                <w:bCs/>
+                <w:sz w:val="18"/>
+                <w:szCs w:val="18"/>
+              </w:rPr>
+            </w:pPr>
+          </w:p>
+        </w:tc>
+        <w:tc>
+          <w:tcPr>
+            <w:tcW w:w="926" w:type="dxa"/>
+            <w:vAlign w:val="center"/>
+          </w:tcPr>
+          <w:p>
+            <w:pPr>
+              <w:jc w:val="center"/>
+              <w:rPr>
+                <w:b/>
+                <w:bCs/>
+                <w:sz w:val="18"/>
+                <w:szCs w:val="18"/>
+              </w:rPr>
+            </w:pPr>
+          </w:p>
+        </w:tc>
+        <w:tc>
+          <w:tcPr>
+            <w:tcW w:w="1055" w:type="dxa"/>
+            <w:vAlign w:val="center"/>
+          </w:tcPr>
+          <w:p>
+            <w:pPr>
+              <w:jc w:val="center"/>
+              <w:rPr>
+                <w:b/>
+                <w:bCs/>
+                <w:sz w:val="18"/>
+                <w:szCs w:val="18"/>
+              </w:rPr>
+            </w:pPr>
+          </w:p>
+        </w:tc>
+        <w:tc>
+          <w:tcPr>
+            <w:tcW w:w="1187" w:type="dxa"/>
+            <w:vAlign w:val="center"/>
+          </w:tcPr>
+          <w:p>
+            <w:pPr>
+              <w:jc w:val="center"/>
+              <w:rPr>
+                <w:b/>
+                <w:bCs/>
+                <w:sz w:val="18"/>
+                <w:szCs w:val="18"/>
+              </w:rPr>
+            </w:pPr>
+          </w:p>
+        </w:tc>
+        <w:tc>
+          <w:tcPr>
+            <w:tcW w:w="1250" w:type="dxa"/>
+            <w:vAlign w:val="center"/>
+          </w:tcPr>
+          <w:p>
+            <w:pPr>
+              <w:jc w:val="center"/>
+              <w:rPr>
+                <w:b/>
+                <w:bCs/>
+                <w:sz w:val="18"/>
+                <w:szCs w:val="18"/>
+              </w:rPr>
+            </w:pPr>
+          </w:p>
+        </w:tc>
+        <w:tc>
+          <w:tcPr>
+            <w:tcW w:w="2557" w:type="dxa"/>
+            <w:vAlign w:val="center"/>
+          </w:tcPr>
+          <w:p>
+            <w:pPr>
+              <w:jc w:val="center"/>
+              <w:rPr>
+                <w:b/>
+                <w:bCs/>
+                <w:sz w:val="18"/>
+                <w:szCs w:val="18"/>
+              </w:rPr>
+            </w:pPr>
+          </w:p>
+        </w:tc>
+      </w:tr>
+      <w:tr>
+        <w:trPr>
+          <w:trHeight w:val="576"/>
+          <w:jc w:val="center"/>
+        </w:trPr>
+        <w:tc>
+          <w:tcPr>
+            <w:tcW w:w="1931" w:type="dxa"/>
+            <w:vAlign w:val="center"/>
+          </w:tcPr>
+          <w:p>
+            <w:pPr>
+              <w:jc w:val="center"/>
+              <w:rPr>
+                <w:b/>
+                <w:bCs/>
+                <w:sz w:val="18"/>
+                <w:szCs w:val="18"/>
+              </w:rPr>
+            </w:pPr>
+            <w:r>
+              <w:rPr>
+                <w:b/>
+                <w:bCs/>
+                <w:sz w:val="18"/>
+                <w:szCs w:val="18"/>
+              </w:rPr>
+              <w:lastRenderedPageBreak/>
+              <w:t xml:space="preserve">Resolver situaciones problemáticas de la vida cotidiana, educación superior y mundo laboral, utilizando operaciones básicas con números, expresiones algebraicas, razonamiento matemático básico y formas y espacio, </w:t>
+            </w:r>
+            <w:r>
+              <w:rPr>
+                <w:b/>
+                <w:bCs/>
+                <w:sz w:val="18"/>
+                <w:szCs w:val="18"/>
+              </w:rPr>
+              <w:t>de acuerdo con</w:t>
+            </w:r>
+            <w:r>
+              <w:rPr>
+                <w:b/>
+                <w:bCs/>
+                <w:sz w:val="18"/>
+                <w:szCs w:val="18"/>
+              </w:rPr>
+              <w:t xml:space="preserve"> requerimientos.</w:t>
+            </w:r>
+          </w:p>
+        </w:tc>
+        <w:tc>
+          <w:tcPr>
+            <w:tcW w:w="1017" w:type="dxa"/>
+            <w:vAlign w:val="center"/>
+          </w:tcPr>
+          <w:p>
+            <w:pPr>
+              <w:jc w:val="center"/>
+              <w:rPr>
+                <w:b/>
+                <w:bCs/>
+                <w:sz w:val="18"/>
+                <w:szCs w:val="18"/>
+              </w:rPr>
+            </w:pPr>
+          </w:p>
+        </w:tc>
+        <w:tc>
+          <w:tcPr>
+            <w:tcW w:w="926" w:type="dxa"/>
+            <w:vAlign w:val="center"/>
+          </w:tcPr>
+          <w:p>
+            <w:pPr>
+              <w:jc w:val="center"/>
+              <w:rPr>
+                <w:b/>
+                <w:bCs/>
+                <w:sz w:val="18"/>
+                <w:szCs w:val="18"/>
+              </w:rPr>
+            </w:pPr>
+          </w:p>
+        </w:tc>
+        <w:tc>
+          <w:tcPr>
+            <w:tcW w:w="1055" w:type="dxa"/>
+            <w:vAlign w:val="center"/>
+          </w:tcPr>
+          <w:p>
+            <w:pPr>
+              <w:jc w:val="center"/>
+              <w:rPr>
+                <w:b/>
+                <w:bCs/>
+                <w:sz w:val="18"/>
+                <w:szCs w:val="18"/>
+              </w:rPr>
+            </w:pPr>
+          </w:p>
+        </w:tc>
+        <w:tc>
+          <w:tcPr>
+            <w:tcW w:w="1187" w:type="dxa"/>
+            <w:vAlign w:val="center"/>
+          </w:tcPr>
+          <w:p>
+            <w:pPr>
+              <w:jc w:val="center"/>
+              <w:rPr>
+                <w:b/>
+                <w:bCs/>
+                <w:sz w:val="18"/>
+                <w:szCs w:val="18"/>
+              </w:rPr>
+            </w:pPr>
+          </w:p>
+        </w:tc>
+        <w:tc>
+          <w:tcPr>
+            <w:tcW w:w="1250" w:type="dxa"/>
+            <w:vAlign w:val="center"/>
+          </w:tcPr>
+          <w:p>
+            <w:pPr>
+              <w:jc w:val="center"/>
+              <w:rPr>
+                <w:b/>
+                <w:bCs/>
+                <w:sz w:val="18"/>
+                <w:szCs w:val="18"/>
+              </w:rPr>
+            </w:pPr>
+          </w:p>
+        </w:tc>
+        <w:tc>
+          <w:tcPr>
+            <w:tcW w:w="2557" w:type="dxa"/>
+            <w:vAlign w:val="center"/>
+          </w:tcPr>
+          <w:p>
+            <w:pPr>
+              <w:jc w:val="center"/>
+              <w:rPr>
+                <w:b/>
+                <w:bCs/>
+                <w:sz w:val="18"/>
+                <w:szCs w:val="18"/>
+              </w:rPr>
+            </w:pPr>
+          </w:p>
+        </w:tc>
+      </w:tr>
+      <w:tr>
+        <w:trPr>
+          <w:trHeight w:val="576"/>
+          <w:jc w:val="center"/>
+        </w:trPr>
+        <w:tc>
+          <w:tcPr>
+            <w:tcW w:w="1931" w:type="dxa"/>
+            <w:vAlign w:val="center"/>
+          </w:tcPr>
+          <w:p>
+            <w:pPr>
+              <w:jc w:val="center"/>
+              <w:rPr>
+                <w:b/>
+                <w:bCs/>
+                <w:sz w:val="18"/>
+                <w:szCs w:val="18"/>
+              </w:rPr>
+            </w:pPr>
+            <w:r>
+              <w:rPr>
+                <w:b/>
+                <w:bCs/>
+                <w:sz w:val="18"/>
+                <w:szCs w:val="18"/>
+              </w:rPr>
+              <w:t xml:space="preserve">Resolver situaciones problemáticas de la vida cotidiana, educación superior y mundo laboral, utilizando elementos de las matemáticas discretas y relaciones funcionales, </w:t>
+            </w:r>
+            <w:r>
+              <w:rPr>
+                <w:b/>
+                <w:bCs/>
+                <w:sz w:val="18"/>
+                <w:szCs w:val="18"/>
+              </w:rPr>
+              <w:t>de acuerdo con</w:t>
+            </w:r>
+            <w:r>
+              <w:rPr>
+                <w:b/>
+                <w:bCs/>
+                <w:sz w:val="18"/>
+                <w:szCs w:val="18"/>
+              </w:rPr>
+              <w:t xml:space="preserve"> requerimientos.</w:t>
+            </w:r>
+          </w:p>
+        </w:tc>
+        <w:tc>
+          <w:tcPr>
+            <w:tcW w:w="1017" w:type="dxa"/>
+            <w:vAlign w:val="center"/>
+          </w:tcPr>
+          <w:p>
+            <w:pPr>
+              <w:jc w:val="center"/>
+              <w:rPr>
+                <w:b/>
+                <w:bCs/>
+                <w:sz w:val="18"/>
+                <w:szCs w:val="18"/>
+              </w:rPr>
+            </w:pPr>
+          </w:p>
+        </w:tc>
+        <w:tc>
+          <w:tcPr>
+            <w:tcW w:w="926" w:type="dxa"/>
+            <w:vAlign w:val="center"/>
+          </w:tcPr>
+          <w:p>
+            <w:pPr>
+              <w:jc w:val="center"/>
+              <w:rPr>
+                <w:b/>
+                <w:bCs/>
+                <w:sz w:val="18"/>
+                <w:szCs w:val="18"/>
+              </w:rPr>
+            </w:pPr>
+          </w:p>
+        </w:tc>
+        <w:tc>
+          <w:tcPr>
+            <w:tcW w:w="1055" w:type="dxa"/>
+            <w:vAlign w:val="center"/>
+          </w:tcPr>
+          <w:p>
+            <w:pPr>
+              <w:jc w:val="center"/>
+              <w:rPr>
+                <w:b/>
+                <w:bCs/>
+                <w:sz w:val="18"/>
+                <w:szCs w:val="18"/>
+              </w:rPr>
+            </w:pPr>
+          </w:p>
+        </w:tc>
+        <w:tc>
+          <w:tcPr>
+            <w:tcW w:w="1187" w:type="dxa"/>
+            <w:vAlign w:val="center"/>
+          </w:tcPr>
+          <w:p>
+            <w:pPr>
+              <w:jc w:val="center"/>
+              <w:rPr>
+                <w:b/>
+                <w:bCs/>
+                <w:sz w:val="18"/>
+                <w:szCs w:val="18"/>
+              </w:rPr>
+            </w:pPr>
+          </w:p>
+        </w:tc>
+        <w:tc>
+          <w:tcPr>
+            <w:tcW w:w="1250" w:type="dxa"/>
+            <w:vAlign w:val="center"/>
+          </w:tcPr>
+          <w:p>
+            <w:pPr>
+              <w:jc w:val="center"/>
+              <w:rPr>
+                <w:b/>
+                <w:bCs/>
+                <w:sz w:val="18"/>
+                <w:szCs w:val="18"/>
+              </w:rPr>
+            </w:pPr>
+          </w:p>
+        </w:tc>
+        <w:tc>
+          <w:tcPr>
+            <w:tcW w:w="2557" w:type="dxa"/>
+            <w:vAlign w:val="center"/>
+          </w:tcPr>
+          <w:p>
+            <w:pPr>
+              <w:jc w:val="center"/>
+              <w:rPr>
+                <w:b/>
+                <w:bCs/>
+                <w:sz w:val="18"/>
+                <w:szCs w:val="18"/>
+              </w:rPr>
+            </w:pPr>
+          </w:p>
+        </w:tc>
+      </w:tr>
+      <w:tr>
+        <w:trPr>
+          <w:trHeight w:val="576"/>
+          <w:jc w:val="center"/>
+        </w:trPr>
+        <w:tc>
+          <w:tcPr>
+            <w:tcW w:w="1931" w:type="dxa"/>
+            <w:vAlign w:val="center"/>
+          </w:tcPr>
+          <w:p>
+            <w:pPr>
+              <w:jc w:val="center"/>
+              <w:rPr>
+                <w:b/>
+                <w:bCs/>
+                <w:sz w:val="18"/>
+                <w:szCs w:val="18"/>
+              </w:rPr>
+            </w:pPr>
+            <w:r>
+              <w:rPr>
+                <w:b/>
+                <w:bCs/>
+                <w:sz w:val="18"/>
+                <w:szCs w:val="18"/>
+              </w:rPr>
+              <w:t xml:space="preserve">Resolver situaciones problemáticas de la educación superior y mundo laboral, utilizando elementos de la estadística descriptiva, </w:t>
+            </w:r>
+            <w:r>
+              <w:rPr>
+                <w:b/>
+                <w:bCs/>
+                <w:sz w:val="18"/>
+                <w:szCs w:val="18"/>
+              </w:rPr>
+              <w:t>de acuerdo con</w:t>
+            </w:r>
+            <w:r>
+              <w:rPr>
+                <w:b/>
+                <w:bCs/>
+                <w:sz w:val="18"/>
+                <w:szCs w:val="18"/>
+              </w:rPr>
+              <w:t xml:space="preserve"> requerimientos.</w:t>
+            </w:r>
+          </w:p>
+        </w:tc>
+        <w:tc>
+          <w:tcPr>
+            <w:tcW w:w="1017" w:type="dxa"/>
+            <w:vAlign w:val="center"/>
+          </w:tcPr>
+          <w:p>
+            <w:pPr>
+              <w:jc w:val="center"/>
+              <w:rPr>
+                <w:b/>
+                <w:bCs/>
+                <w:sz w:val="18"/>
+                <w:szCs w:val="18"/>
+              </w:rPr>
+            </w:pPr>
+          </w:p>
+        </w:tc>
+        <w:tc>
+          <w:tcPr>
+            <w:tcW w:w="926" w:type="dxa"/>
+            <w:vAlign w:val="center"/>
+          </w:tcPr>
+          <w:p>
+            <w:pPr>
+              <w:jc w:val="center"/>
+              <w:rPr>
+                <w:b/>
+                <w:bCs/>
+                <w:sz w:val="18"/>
+                <w:szCs w:val="18"/>
+              </w:rPr>
+            </w:pPr>
+          </w:p>
+        </w:tc>
+        <w:tc>
+          <w:tcPr>
+            <w:tcW w:w="1055" w:type="dxa"/>
+            <w:vAlign w:val="center"/>
+          </w:tcPr>
+          <w:p>
+            <w:pPr>
+              <w:jc w:val="center"/>
+              <w:rPr>
+                <w:b/>
+                <w:bCs/>
+                <w:sz w:val="18"/>
+                <w:szCs w:val="18"/>
+              </w:rPr>
+            </w:pPr>
+          </w:p>
+        </w:tc>
+        <w:tc>
+          <w:tcPr>
+            <w:tcW w:w="1187" w:type="dxa"/>
+            <w:vAlign w:val="center"/>
+          </w:tcPr>
+          <w:p>
+            <w:pPr>
+              <w:jc w:val="center"/>
+              <w:rPr>
+                <w:b/>
+                <w:bCs/>
+                <w:sz w:val="18"/>
+                <w:szCs w:val="18"/>
+              </w:rPr>
+            </w:pPr>
+          </w:p>
+        </w:tc>
+        <w:tc>
+          <w:tcPr>
+            <w:tcW w:w="1250" w:type="dxa"/>
+            <w:vAlign w:val="center"/>
+          </w:tcPr>
+          <w:p>
+            <w:pPr>
+              <w:jc w:val="center"/>
+              <w:rPr>
+                <w:b/>
+                <w:bCs/>
+                <w:sz w:val="18"/>
+                <w:szCs w:val="18"/>
+              </w:rPr>
+            </w:pPr>
+          </w:p>
+        </w:tc>
+        <w:tc>
+          <w:tcPr>
+            <w:tcW w:w="2557" w:type="dxa"/>
+            <w:vAlign w:val="center"/>
+          </w:tcPr>
+          <w:p>
+            <w:pPr>
+              <w:jc w:val="center"/>
+              <w:rPr>
+                <w:b/>
+                <w:bCs/>
+                <w:sz w:val="18"/>
+                <w:szCs w:val="18"/>
+              </w:rPr>
+            </w:pPr>
+          </w:p>
+        </w:tc>
+      </w:tr>
+      <w:tr>
+        <w:trPr>
+          <w:trHeight w:val="576"/>
+          <w:jc w:val="center"/>
+        </w:trPr>
+        <w:tc>
+          <w:tcPr>
+            <w:tcW w:w="1931" w:type="dxa"/>
+            <w:vAlign w:val="center"/>
+          </w:tcPr>
+          <w:p>
+            <w:pPr>
+              <w:jc w:val="center"/>
+              <w:rPr>
+                <w:b/>
+                <w:bCs/>
+                <w:sz w:val="18"/>
+                <w:szCs w:val="18"/>
+              </w:rPr>
+            </w:pPr>
+            <w:r>
+              <w:rPr>
+                <w:b/>
+                <w:bCs/>
+                <w:sz w:val="18"/>
+                <w:szCs w:val="18"/>
+              </w:rPr>
+              <w:t>Comunicar en forma oral o escrita, aplicando herramientas lingüístico-pragmáticas y estrategias de comprensión que permiten la solución de problemas comunicativos en los contextos académicos, de acuerdo al marco común de referencia de las lenguas.</w:t>
+            </w:r>
+          </w:p>
+        </w:tc>
+        <w:tc>
+          <w:tcPr>
+            <w:tcW w:w="1017" w:type="dxa"/>
+            <w:vAlign w:val="center"/>
+          </w:tcPr>
+          <w:p>
+            <w:pPr>
+              <w:jc w:val="center"/>
+              <w:rPr>
+                <w:b/>
+                <w:bCs/>
+                <w:sz w:val="18"/>
+                <w:szCs w:val="18"/>
+              </w:rPr>
+            </w:pPr>
+          </w:p>
+        </w:tc>
+        <w:tc>
+          <w:tcPr>
+            <w:tcW w:w="926" w:type="dxa"/>
+            <w:vAlign w:val="center"/>
+          </w:tcPr>
+          <w:p>
+            <w:pPr>
+              <w:jc w:val="center"/>
+              <w:rPr>
+                <w:b/>
+                <w:bCs/>
+                <w:sz w:val="18"/>
+                <w:szCs w:val="18"/>
+              </w:rPr>
+            </w:pPr>
+          </w:p>
+        </w:tc>
+        <w:tc>
+          <w:tcPr>
+            <w:tcW w:w="1055" w:type="dxa"/>
+            <w:vAlign w:val="center"/>
+          </w:tcPr>
+          <w:p>
+            <w:pPr>
+              <w:jc w:val="center"/>
+              <w:rPr>
+                <w:b/>
+                <w:bCs/>
+                <w:sz w:val="18"/>
+                <w:szCs w:val="18"/>
+              </w:rPr>
+            </w:pPr>
+          </w:p>
+        </w:tc>
+        <w:tc>
+          <w:tcPr>
+            <w:tcW w:w="1187" w:type="dxa"/>
+            <w:vAlign w:val="center"/>
+          </w:tcPr>
+          <w:p>
+            <w:pPr>
+              <w:jc w:val="center"/>
+              <w:rPr>
+                <w:b/>
+                <w:bCs/>
+                <w:sz w:val="18"/>
+                <w:szCs w:val="18"/>
+              </w:rPr>
+            </w:pPr>
+          </w:p>
+        </w:tc>
+        <w:tc>
+          <w:tcPr>
+            <w:tcW w:w="1250" w:type="dxa"/>
+            <w:vAlign w:val="center"/>
+          </w:tcPr>
+          <w:p>
+            <w:pPr>
+              <w:jc w:val="center"/>
+              <w:rPr>
+                <w:b/>
+                <w:bCs/>
+                <w:sz w:val="18"/>
+                <w:szCs w:val="18"/>
+              </w:rPr>
+            </w:pPr>
+          </w:p>
+        </w:tc>
+        <w:tc>
+          <w:tcPr>
+            <w:tcW w:w="2557" w:type="dxa"/>
+            <w:vAlign w:val="center"/>
+          </w:tcPr>
+          <w:p>
+            <w:pPr>
+              <w:jc w:val="center"/>
+              <w:rPr>
+                <w:b/>
+                <w:bCs/>
+                <w:sz w:val="18"/>
+                <w:szCs w:val="18"/>
+              </w:rPr>
+            </w:pPr>
+          </w:p>
+        </w:tc>
+      </w:tr>
+      <w:tr>
+        <w:trPr>
+          <w:trHeight w:val="576"/>
+          <w:jc w:val="center"/>
+        </w:trPr>
+        <w:tc>
+          <w:tcPr>
+            <w:tcW w:w="1931" w:type="dxa"/>
+            <w:vAlign w:val="center"/>
+          </w:tcPr>
+          <w:p>
+            <w:pPr>
+              <w:jc w:val="center"/>
+              <w:rPr>
+                <w:b/>
+                <w:bCs/>
+                <w:sz w:val="18"/>
+                <w:szCs w:val="18"/>
+              </w:rPr>
+            </w:pPr>
+            <w:r>
+              <w:rPr>
+                <w:b/>
+                <w:bCs/>
+                <w:sz w:val="18"/>
+                <w:szCs w:val="18"/>
+              </w:rPr>
+              <w:t xml:space="preserve">Comunicarse de forma oral y escrita usando el idioma inglés en situaciones </w:t>
+            </w:r>
+            <w:r>
+              <w:rPr>
+                <w:b/>
+                <w:bCs/>
+                <w:sz w:val="18"/>
+                <w:szCs w:val="18"/>
+              </w:rPr>
+              <w:t>sociolaborales</w:t>
+            </w:r>
+            <w:r>
+              <w:rPr>
+                <w:b/>
+                <w:bCs/>
+                <w:sz w:val="18"/>
+                <w:szCs w:val="18"/>
+              </w:rPr>
+              <w:t xml:space="preserve"> a un nivel intermedio, según la Tabla de </w:t>
+            </w:r>
+            <w:r>
+              <w:rPr>
+                <w:b/>
+                <w:bCs/>
+                <w:sz w:val="18"/>
+                <w:szCs w:val="18"/>
+              </w:rPr>
+              <w:lastRenderedPageBreak/>
+              <w:t>Competencias TOEIC y CEFR.</w:t>
+            </w:r>
+          </w:p>
+        </w:tc>
+        <w:tc>
+          <w:tcPr>
+            <w:tcW w:w="1017" w:type="dxa"/>
+            <w:vAlign w:val="center"/>
+          </w:tcPr>
+          <w:p>
+            <w:pPr>
+              <w:jc w:val="center"/>
+              <w:rPr>
+                <w:b/>
+                <w:bCs/>
+                <w:sz w:val="18"/>
+                <w:szCs w:val="18"/>
+              </w:rPr>
+            </w:pPr>
+          </w:p>
+        </w:tc>
+        <w:tc>
+          <w:tcPr>
+            <w:tcW w:w="926" w:type="dxa"/>
+            <w:vAlign w:val="center"/>
+          </w:tcPr>
+          <w:p>
+            <w:pPr>
+              <w:jc w:val="center"/>
+              <w:rPr>
+                <w:b/>
+                <w:bCs/>
+                <w:sz w:val="18"/>
+                <w:szCs w:val="18"/>
+              </w:rPr>
+            </w:pPr>
+          </w:p>
+        </w:tc>
+        <w:tc>
+          <w:tcPr>
+            <w:tcW w:w="1055" w:type="dxa"/>
+            <w:vAlign w:val="center"/>
+          </w:tcPr>
+          <w:p>
+            <w:pPr>
+              <w:jc w:val="center"/>
+              <w:rPr>
+                <w:b/>
+                <w:bCs/>
+                <w:sz w:val="18"/>
+                <w:szCs w:val="18"/>
+              </w:rPr>
+            </w:pPr>
+          </w:p>
+        </w:tc>
+        <w:tc>
+          <w:tcPr>
+            <w:tcW w:w="1187" w:type="dxa"/>
+            <w:vAlign w:val="center"/>
+          </w:tcPr>
+          <w:p>
+            <w:pPr>
+              <w:jc w:val="center"/>
+              <w:rPr>
+                <w:b/>
+                <w:bCs/>
+                <w:sz w:val="18"/>
+                <w:szCs w:val="18"/>
+              </w:rPr>
+            </w:pPr>
+          </w:p>
+        </w:tc>
+        <w:tc>
+          <w:tcPr>
+            <w:tcW w:w="1250" w:type="dxa"/>
+            <w:vAlign w:val="center"/>
+          </w:tcPr>
+          <w:p>
+            <w:pPr>
+              <w:jc w:val="center"/>
+              <w:rPr>
+                <w:b/>
+                <w:bCs/>
+                <w:sz w:val="18"/>
+                <w:szCs w:val="18"/>
+              </w:rPr>
+            </w:pPr>
+          </w:p>
+        </w:tc>
+        <w:tc>
+          <w:tcPr>
+            <w:tcW w:w="2557" w:type="dxa"/>
+            <w:vAlign w:val="center"/>
+          </w:tcPr>
+          <w:p>
+            <w:pPr>
+              <w:jc w:val="center"/>
+              <w:rPr>
+                <w:b/>
+                <w:bCs/>
+                <w:sz w:val="18"/>
+                <w:szCs w:val="18"/>
+              </w:rPr>
+            </w:pPr>
+          </w:p>
+        </w:tc>
+      </w:tr>
+      <w:tr>
+        <w:trPr>
+          <w:trHeight w:val="576"/>
+          <w:jc w:val="center"/>
+        </w:trPr>
+        <w:tc>
+          <w:tcPr>
+            <w:tcW w:w="1931" w:type="dxa"/>
+            <w:vAlign w:val="center"/>
+          </w:tcPr>
+          <w:p>
+            <w:pPr>
+              <w:jc w:val="center"/>
+              <w:rPr>
+                <w:b/>
+                <w:bCs/>
+                <w:sz w:val="18"/>
+                <w:szCs w:val="18"/>
+              </w:rPr>
+            </w:pPr>
+            <w:r>
+              <w:rPr>
+                <w:b/>
+                <w:bCs/>
+                <w:sz w:val="18"/>
+                <w:szCs w:val="18"/>
+              </w:rPr>
+              <w:t>Comunicarse usando el idioma inglés en situaciones laborales a un nivel intermedio relacionado con su área de especialización, según la Tabla de Competencias TOEIC y CEFR.</w:t>
+            </w:r>
+          </w:p>
+        </w:tc>
+        <w:tc>
+          <w:tcPr>
+            <w:tcW w:w="1017" w:type="dxa"/>
+            <w:vAlign w:val="center"/>
+          </w:tcPr>
+          <w:p>
+            <w:pPr>
+              <w:jc w:val="center"/>
+              <w:rPr>
+                <w:b/>
+                <w:bCs/>
+                <w:sz w:val="18"/>
+                <w:szCs w:val="18"/>
+              </w:rPr>
+            </w:pPr>
+          </w:p>
+        </w:tc>
+        <w:tc>
+          <w:tcPr>
+            <w:tcW w:w="926" w:type="dxa"/>
+            <w:vAlign w:val="center"/>
+          </w:tcPr>
+          <w:p>
+            <w:pPr>
+              <w:jc w:val="center"/>
+              <w:rPr>
+                <w:b/>
+                <w:bCs/>
+                <w:sz w:val="18"/>
+                <w:szCs w:val="18"/>
+              </w:rPr>
+            </w:pPr>
+          </w:p>
+        </w:tc>
+        <w:tc>
+          <w:tcPr>
+            <w:tcW w:w="1055" w:type="dxa"/>
+            <w:vAlign w:val="center"/>
+          </w:tcPr>
+          <w:p>
+            <w:pPr>
+              <w:jc w:val="center"/>
+              <w:rPr>
+                <w:b/>
+                <w:bCs/>
+                <w:sz w:val="18"/>
+                <w:szCs w:val="18"/>
+              </w:rPr>
+            </w:pPr>
+          </w:p>
+        </w:tc>
+        <w:tc>
+          <w:tcPr>
+            <w:tcW w:w="1187" w:type="dxa"/>
+            <w:vAlign w:val="center"/>
+          </w:tcPr>
+          <w:p>
+            <w:pPr>
+              <w:jc w:val="center"/>
+              <w:rPr>
+                <w:b/>
+                <w:bCs/>
+                <w:sz w:val="18"/>
+                <w:szCs w:val="18"/>
+              </w:rPr>
+            </w:pPr>
+          </w:p>
+        </w:tc>
+        <w:tc>
+          <w:tcPr>
+            <w:tcW w:w="1250" w:type="dxa"/>
+            <w:vAlign w:val="center"/>
+          </w:tcPr>
+          <w:p>
+            <w:pPr>
+              <w:jc w:val="center"/>
+              <w:rPr>
+                <w:b/>
+                <w:bCs/>
+                <w:sz w:val="18"/>
+                <w:szCs w:val="18"/>
+              </w:rPr>
+            </w:pPr>
+          </w:p>
+        </w:tc>
+        <w:tc>
+          <w:tcPr>
+            <w:tcW w:w="2557" w:type="dxa"/>
+            <w:vAlign w:val="center"/>
+          </w:tcPr>
+          <w:p>
+            <w:pPr>
+              <w:jc w:val="center"/>
+              <w:rPr>
+                <w:b/>
+                <w:bCs/>
+                <w:sz w:val="18"/>
+                <w:szCs w:val="18"/>
+              </w:rPr>
+            </w:pPr>
+          </w:p>
+        </w:tc>
+      </w:tr>
+      <w:tr>
+        <w:trPr>
+          <w:trHeight w:val="576"/>
+          <w:jc w:val="center"/>
+        </w:trPr>
+        <w:tc>
+          <w:tcPr>
+            <w:tcW w:w="1931" w:type="dxa"/>
+            <w:vAlign w:val="center"/>
+          </w:tcPr>
+          <w:p>
+            <w:pPr>
+              <w:jc w:val="center"/>
+              <w:rPr>
+                <w:b/>
+                <w:bCs/>
+                <w:sz w:val="18"/>
+                <w:szCs w:val="18"/>
+              </w:rPr>
+            </w:pPr>
+            <w:r>
+              <w:rPr>
+                <w:b/>
+                <w:bCs/>
+                <w:sz w:val="18"/>
+                <w:szCs w:val="18"/>
+              </w:rPr>
+              <w:t>Desarrollar la propia habilidad emprendedora, a través de experiencias en el ámbito de la especialidad.</w:t>
+            </w:r>
+          </w:p>
+        </w:tc>
+        <w:tc>
+          <w:tcPr>
+            <w:tcW w:w="1017" w:type="dxa"/>
+            <w:vAlign w:val="center"/>
+          </w:tcPr>
+          <w:p>
+            <w:pPr>
+              <w:jc w:val="center"/>
+              <w:rPr>
+                <w:b/>
+                <w:bCs/>
+                <w:sz w:val="18"/>
+                <w:szCs w:val="18"/>
+              </w:rPr>
+            </w:pPr>
+          </w:p>
+        </w:tc>
+        <w:tc>
+          <w:tcPr>
+            <w:tcW w:w="926" w:type="dxa"/>
+            <w:vAlign w:val="center"/>
+          </w:tcPr>
+          <w:p>
+            <w:pPr>
+              <w:jc w:val="center"/>
+              <w:rPr>
+                <w:b/>
+                <w:bCs/>
+                <w:sz w:val="18"/>
+                <w:szCs w:val="18"/>
+              </w:rPr>
+            </w:pPr>
+          </w:p>
+        </w:tc>
+        <w:tc>
+          <w:tcPr>
+            <w:tcW w:w="1055" w:type="dxa"/>
+            <w:vAlign w:val="center"/>
+          </w:tcPr>
+          <w:p>
+            <w:pPr>
+              <w:jc w:val="center"/>
+              <w:rPr>
+                <w:b/>
+                <w:bCs/>
+                <w:sz w:val="18"/>
+                <w:szCs w:val="18"/>
+              </w:rPr>
+            </w:pPr>
+          </w:p>
+        </w:tc>
+        <w:tc>
+          <w:tcPr>
+            <w:tcW w:w="1187" w:type="dxa"/>
+            <w:vAlign w:val="center"/>
+          </w:tcPr>
+          <w:p>
+            <w:pPr>
+              <w:jc w:val="center"/>
+              <w:rPr>
+                <w:b/>
+                <w:bCs/>
+                <w:sz w:val="18"/>
+                <w:szCs w:val="18"/>
+              </w:rPr>
+            </w:pPr>
+          </w:p>
+        </w:tc>
+        <w:tc>
+          <w:tcPr>
+            <w:tcW w:w="1250" w:type="dxa"/>
+            <w:vAlign w:val="center"/>
+          </w:tcPr>
+          <w:p>
+            <w:pPr>
+              <w:jc w:val="center"/>
+              <w:rPr>
+                <w:b/>
+                <w:bCs/>
+                <w:sz w:val="18"/>
+                <w:szCs w:val="18"/>
+              </w:rPr>
+            </w:pPr>
+          </w:p>
+        </w:tc>
+        <w:tc>
+          <w:tcPr>
+            <w:tcW w:w="2557" w:type="dxa"/>
+            <w:vAlign w:val="center"/>
+          </w:tcPr>
+          <w:p>
+            <w:pPr>
+              <w:jc w:val="center"/>
+              <w:rPr>
+                <w:b/>
+                <w:bCs/>
+                <w:sz w:val="18"/>
+                <w:szCs w:val="18"/>
+              </w:rPr>
+            </w:pPr>
+          </w:p>
+        </w:tc>
+      </w:tr>
+      <w:tr>
+        <w:trPr>
+          <w:trHeight w:val="576"/>
+          <w:jc w:val="center"/>
+        </w:trPr>
+        <w:tc>
+          <w:tcPr>
+            <w:tcW w:w="1931" w:type="dxa"/>
+            <w:vAlign w:val="center"/>
+          </w:tcPr>
+          <w:p>
+            <w:pPr>
+              <w:jc w:val="center"/>
+              <w:rPr>
+                <w:b/>
+                <w:bCs/>
+                <w:sz w:val="18"/>
+                <w:szCs w:val="18"/>
+              </w:rPr>
+            </w:pPr>
+            <w:r>
+              <w:rPr>
+                <w:b/>
+                <w:bCs/>
+                <w:sz w:val="18"/>
+                <w:szCs w:val="18"/>
+              </w:rPr>
+              <w:t>Elaborar proyectos innovadores que agreguen valor a contextos sociales y productivos, de acuerdo a las necesidades del entorno.</w:t>
+            </w:r>
+          </w:p>
+        </w:tc>
+        <w:tc>
+          <w:tcPr>
+            <w:tcW w:w="1017" w:type="dxa"/>
+            <w:vAlign w:val="center"/>
+          </w:tcPr>
+          <w:p>
+            <w:pPr>
+              <w:jc w:val="center"/>
+              <w:rPr>
+                <w:b/>
+                <w:bCs/>
+                <w:sz w:val="18"/>
+                <w:szCs w:val="18"/>
+              </w:rPr>
+            </w:pPr>
+          </w:p>
+        </w:tc>
+        <w:tc>
+          <w:tcPr>
+            <w:tcW w:w="926" w:type="dxa"/>
+            <w:vAlign w:val="center"/>
+          </w:tcPr>
+          <w:p>
+            <w:pPr>
+              <w:jc w:val="center"/>
+              <w:rPr>
+                <w:b/>
+                <w:bCs/>
+                <w:sz w:val="18"/>
+                <w:szCs w:val="18"/>
+              </w:rPr>
+            </w:pPr>
+          </w:p>
+        </w:tc>
+        <w:tc>
+          <w:tcPr>
+            <w:tcW w:w="1055" w:type="dxa"/>
+            <w:vAlign w:val="center"/>
+          </w:tcPr>
+          <w:p>
+            <w:pPr>
+              <w:jc w:val="center"/>
+              <w:rPr>
+                <w:b/>
+                <w:bCs/>
+                <w:sz w:val="18"/>
+                <w:szCs w:val="18"/>
+              </w:rPr>
+            </w:pPr>
+          </w:p>
+        </w:tc>
+        <w:tc>
+          <w:tcPr>
+            <w:tcW w:w="1187" w:type="dxa"/>
+            <w:vAlign w:val="center"/>
+          </w:tcPr>
+          <w:p>
+            <w:pPr>
+              <w:jc w:val="center"/>
+              <w:rPr>
+                <w:b/>
+                <w:bCs/>
+                <w:sz w:val="18"/>
+                <w:szCs w:val="18"/>
+              </w:rPr>
+            </w:pPr>
+          </w:p>
+        </w:tc>
+        <w:tc>
+          <w:tcPr>
+            <w:tcW w:w="1250" w:type="dxa"/>
+            <w:vAlign w:val="center"/>
+          </w:tcPr>
+          <w:p>
+            <w:pPr>
+              <w:jc w:val="center"/>
+              <w:rPr>
+                <w:b/>
+                <w:bCs/>
+                <w:sz w:val="18"/>
+                <w:szCs w:val="18"/>
+              </w:rPr>
+            </w:pPr>
+          </w:p>
+        </w:tc>
+        <w:tc>
+          <w:tcPr>
+            <w:tcW w:w="2557" w:type="dxa"/>
+            <w:vAlign w:val="center"/>
+          </w:tcPr>
+          <w:p>
+            <w:pPr>
+              <w:jc w:val="center"/>
+              <w:rPr>
+                <w:b/>
+                <w:bCs/>
+                <w:sz w:val="18"/>
+                <w:szCs w:val="18"/>
+              </w:rPr>
+            </w:pPr>
+          </w:p>
+        </w:tc>
+      </w:tr>
+      <w:tr>
+        <w:trPr>
+          <w:trHeight w:val="576"/>
+          <w:jc w:val="center"/>
+        </w:trPr>
+        <w:tc>
+          <w:tcPr>
+            <w:tcW w:w="1931" w:type="dxa"/>
+            <w:vAlign w:val="center"/>
+          </w:tcPr>
+          <w:p>
+            <w:pPr>
+              <w:jc w:val="center"/>
+              <w:rPr>
+                <w:b/>
+                <w:bCs/>
+                <w:sz w:val="18"/>
+                <w:szCs w:val="18"/>
+              </w:rPr>
+            </w:pPr>
+            <w:r>
+              <w:rPr>
+                <w:b/>
+                <w:bCs/>
+                <w:sz w:val="18"/>
+                <w:szCs w:val="18"/>
+              </w:rPr>
+              <w:t>Reconocer un desempeño correcto en situaciones de la profesión o especialidad en el área de la informática.</w:t>
+            </w:r>
+          </w:p>
+        </w:tc>
+        <w:tc>
+          <w:tcPr>
+            <w:tcW w:w="1017" w:type="dxa"/>
+            <w:vAlign w:val="center"/>
+          </w:tcPr>
+          <w:p>
+            <w:pPr>
+              <w:jc w:val="center"/>
+              <w:rPr>
+                <w:b/>
+                <w:bCs/>
+                <w:sz w:val="18"/>
+                <w:szCs w:val="18"/>
+              </w:rPr>
+            </w:pPr>
+          </w:p>
+        </w:tc>
+        <w:tc>
+          <w:tcPr>
+            <w:tcW w:w="926" w:type="dxa"/>
+            <w:vAlign w:val="center"/>
+          </w:tcPr>
+          <w:p>
+            <w:pPr>
+              <w:jc w:val="center"/>
+              <w:rPr>
+                <w:b/>
+                <w:bCs/>
+                <w:sz w:val="18"/>
+                <w:szCs w:val="18"/>
+              </w:rPr>
+            </w:pPr>
+          </w:p>
+        </w:tc>
+        <w:tc>
+          <w:tcPr>
+            <w:tcW w:w="1055" w:type="dxa"/>
+            <w:vAlign w:val="center"/>
+          </w:tcPr>
+          <w:p>
+            <w:pPr>
+              <w:jc w:val="center"/>
+              <w:rPr>
+                <w:b/>
+                <w:bCs/>
+                <w:sz w:val="18"/>
+                <w:szCs w:val="18"/>
+              </w:rPr>
+            </w:pPr>
+          </w:p>
+        </w:tc>
+        <w:tc>
+          <w:tcPr>
+            <w:tcW w:w="1187" w:type="dxa"/>
+            <w:vAlign w:val="center"/>
+          </w:tcPr>
+          <w:p>
+            <w:pPr>
+              <w:jc w:val="center"/>
+              <w:rPr>
+                <w:b/>
+                <w:bCs/>
+                <w:sz w:val="18"/>
+                <w:szCs w:val="18"/>
+              </w:rPr>
+            </w:pPr>
+          </w:p>
+        </w:tc>
+        <w:tc>
+          <w:tcPr>
+            <w:tcW w:w="1250" w:type="dxa"/>
+            <w:vAlign w:val="center"/>
+          </w:tcPr>
+          <w:p>
+            <w:pPr>
+              <w:jc w:val="center"/>
+              <w:rPr>
+                <w:b/>
+                <w:bCs/>
+                <w:sz w:val="18"/>
+                <w:szCs w:val="18"/>
+              </w:rPr>
+            </w:pPr>
+          </w:p>
+        </w:tc>
+        <w:tc>
+          <w:tcPr>
+            <w:tcW w:w="2557" w:type="dxa"/>
+            <w:vAlign w:val="center"/>
           </w:tcPr>
           <w:p>
             <w:pPr>
@@ -2234,8 +4173,6 @@
     </w:tbl>
     <w:p>
       <w:pPr>
-        <w:pStyle w:val="Prrafodelista"/>
-        <w:ind w:left="435"/>
         <w:rPr>
           <w:rFonts w:cstheme="minorHAnsi"/>
           <w:sz w:val="20"/>
@@ -2523,14 +4460,14 @@
                 </wp:anchor>
               </w:drawing>
             </mc:Choice>
-            <mc:Fallback xmlns:a14="http://schemas.microsoft.com/office/drawing/2010/main" xmlns:a="http://schemas.openxmlformats.org/drawingml/2006/main">
+            <mc:Fallback>
               <w:pict>
-                <v:group id="Grupo 32" style="position:absolute;margin-left:0;margin-top:0;width:610.5pt;height:15pt;z-index:251659264;mso-width-percent:1000;mso-position-horizontal:center;mso-position-horizontal-relative:page;mso-position-vertical:center;mso-position-vertical-relative:bottom-margin-area;mso-width-percent:1000" coordsize="12255,300" coordorigin=",14970" o:spid="_x0000_s1026" w14:anchorId="51D00065" o:gfxdata="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">
+                <v:group w14:anchorId="51D00065" id="Grupo 32" o:spid="_x0000_s1026" style="position:absolute;margin-left:0;margin-top:0;width:610.5pt;height:15pt;z-index:251659264;mso-width-percent:1000;mso-position-horizontal:center;mso-position-horizontal-relative:page;mso-position-vertical:center;mso-position-vertical-relative:bottom-margin-area;mso-width-percent:1000" coordorigin=",14970" coordsize="12255,300" o:gfxdata="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">
                   <v:shapetype id="_x0000_t202" coordsize="21600,21600" o:spt="202" path="m,l,21600r21600,l21600,xe">
                     <v:stroke joinstyle="miter"/>
                     <v:path gradientshapeok="t" o:connecttype="rect"/>
                   </v:shapetype>
-                  <v:shape id="Text Box 25" style="position:absolute;left:10803;top:14982;width:659;height:288;visibility:visible;mso-wrap-style:square;v-text-anchor:top" o:spid="_x0000_s1027" filled="f" stroked="f" type="#_x0000_t202" o:gfxdata="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">
+                  <v:shape id="Text Box 25" o:spid="_x0000_s1027" type="#_x0000_t202" style="position:absolute;left:10803;top:14982;width:659;height:288;visibility:visible;mso-wrap-style:square;v-text-anchor:top" o:gfxdata="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" filled="f" stroked="f">
                     <v:textbox inset="0,0,0,0">
                       <w:txbxContent>
                         <w:p>
@@ -2564,20 +4501,20 @@
                       </w:txbxContent>
                     </v:textbox>
                   </v:shape>
-                  <v:group id="Group 31" style="position:absolute;top:14970;width:12255;height:230;flip:x" coordsize="12255,230" coordorigin="-8,14978" o:spid="_x0000_s1028" o:gfxdata="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">
-                    <v:shapetype id="_x0000_t34" coordsize="21600,21600" o:oned="t" filled="f" o:spt="34" adj="10800" path="m,l@0,0@0,21600,21600,21600e">
+                  <v:group id="Group 31" o:spid="_x0000_s1028" style="position:absolute;top:14970;width:12255;height:230;flip:x" coordorigin="-8,14978" coordsize="12255,230" o:gfxdata="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">
+                    <v:shapetype id="_x0000_t34" coordsize="21600,21600" o:spt="34" o:oned="t" adj="10800" path="m,l@0,0@0,21600,21600,21600e" filled="f">
                       <v:stroke joinstyle="miter"/>
                       <v:formulas>
                         <v:f eqn="val #0"/>
                       </v:formulas>
-                      <v:path fillok="f" arrowok="t" o:connecttype="none"/>
+                      <v:path arrowok="t" fillok="f" o:connecttype="none"/>
                       <v:handles>
                         <v:h position="#0,center"/>
                       </v:handles>
                       <o:lock v:ext="edit" shapetype="t"/>
                     </v:shapetype>
-                    <v:shape id="AutoShape 27" style="position:absolute;left:-8;top:14978;width:1260;height:230;flip:y;visibility:visible;mso-wrap-style:square" o:spid="_x0000_s1029" strokecolor="#a5a5a5" o:connectortype="elbow" type="#_x0000_t34" o:gfxdata="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"/>
-                    <v:shape id="AutoShape 28" style="position:absolute;left:1252;top:14978;width:10995;height:230;rotation:180;visibility:visible;mso-wrap-style:square" o:spid="_x0000_s1030" strokecolor="#a5a5a5" o:connectortype="elbow" type="#_x0000_t34" adj="20904" o:gfxdata="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"/>
+                    <v:shape id="AutoShape 27" o:spid="_x0000_s1029" type="#_x0000_t34" style="position:absolute;left:-8;top:14978;width:1260;height:230;flip:y;visibility:visible;mso-wrap-style:square" o:connectortype="elbow" o:gfxdata="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" strokecolor="#a5a5a5"/>
+                    <v:shape id="AutoShape 28" o:spid="_x0000_s1030" type="#_x0000_t34" style="position:absolute;left:1252;top:14978;width:10995;height:230;rotation:180;visibility:visible;mso-wrap-style:square" o:connectortype="elbow" o:gfxdata="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" adj="20904" strokecolor="#a5a5a5"/>
                   </v:group>
                   <w10:wrap anchorx="page" anchory="margin"/>
                 </v:group>
@@ -8369,7 +10306,6 @@
   <w:style w:type="character" w:default="1" w:styleId="Fuentedeprrafopredeter">
     <w:name w:val="Default Paragraph Font"/>
     <w:uiPriority w:val="1"/>
-    <w:semiHidden/>
     <w:unhideWhenUsed/>
   </w:style>
   <w:style w:type="table" w:default="1" w:styleId="Tablanormal">
@@ -9670,10 +11606,6 @@
 </file>
 
 <file path=customXml/item1.xml><?xml version="1.0" encoding="utf-8"?>
-<b:Sources xmlns:b="http://schemas.openxmlformats.org/officeDocument/2006/bibliography" xmlns="http://schemas.openxmlformats.org/officeDocument/2006/bibliography" SelectedStyle="\APASixthEditionOfficeOnline.xsl" StyleName="APA" Version="6"/>
-</file>
-
-<file path=customXml/item2.xml><?xml version="1.0" encoding="utf-8"?>
 <ct:contentTypeSchema xmlns:ct="http://schemas.microsoft.com/office/2006/metadata/contentType" xmlns:ma="http://schemas.microsoft.com/office/2006/metadata/properties/metaAttributes" ct:_="" ma:_="" ma:contentTypeName="Documento" ma:contentTypeID="0x010100E96778489EE7714D8BD12CC105EB918B" ma:contentTypeVersion="2" ma:contentTypeDescription="Crear nuevo documento." ma:contentTypeScope="" ma:versionID="416c5c7ae9b5d54d83875cd3c65194e3">
   <xsd:schema xmlns:xsd="http://www.w3.org/2001/XMLSchema" xmlns:xs="http://www.w3.org/2001/XMLSchema" xmlns:p="http://schemas.microsoft.com/office/2006/metadata/properties" xmlns:ns2="126e8a1c-9ea9-435a-ac89-d06c80d62e30" targetNamespace="http://schemas.microsoft.com/office/2006/metadata/properties" ma:root="true" ma:fieldsID="70a237c842677bd850644f8595079f5e" ns2:_="">
     <xsd:import namespace="126e8a1c-9ea9-435a-ac89-d06c80d62e30"/>
@@ -9805,13 +11737,11 @@
 </ct:contentTypeSchema>
 </file>
 
-<file path=customXml/item3.xml><?xml version="1.0" encoding="utf-8"?>
-<p:properties xmlns:p="http://schemas.microsoft.com/office/2006/metadata/properties" xmlns:xsi="http://www.w3.org/2001/XMLSchema-instance" xmlns:pc="http://schemas.microsoft.com/office/infopath/2007/PartnerControls">
-  <documentManagement/>
-</p:properties>
+<file path=customXml/item2.xml><?xml version="1.0" encoding="utf-8"?>
+<b:Sources xmlns:b="http://schemas.openxmlformats.org/officeDocument/2006/bibliography" xmlns="http://schemas.openxmlformats.org/officeDocument/2006/bibliography" SelectedStyle="\APASixthEditionOfficeOnline.xsl" StyleName="APA" Version="6"/>
 </file>
 
-<file path=customXml/item4.xml><?xml version="1.0" encoding="utf-8"?>
+<file path=customXml/item3.xml><?xml version="1.0" encoding="utf-8"?>
 <?mso-contentType ?>
 <FormTemplates xmlns="http://schemas.microsoft.com/sharepoint/v3/contenttype/forms">
   <Display>DocumentLibraryForm</Display>
@@ -9820,15 +11750,13 @@
 </FormTemplates>
 </file>
 
-<file path=customXml/itemProps1.xml><?xml version="1.0" encoding="utf-8"?>
-<ds:datastoreItem xmlns:ds="http://schemas.openxmlformats.org/officeDocument/2006/customXml" ds:itemID="{6E8A10B9-B765-4F0B-A47F-7CB788CD8F65}">
-  <ds:schemaRefs>
-    <ds:schemaRef ds:uri="http://schemas.openxmlformats.org/officeDocument/2006/bibliography"/>
-  </ds:schemaRefs>
-</ds:datastoreItem>
+<file path=customXml/item4.xml><?xml version="1.0" encoding="utf-8"?>
+<p:properties xmlns:p="http://schemas.microsoft.com/office/2006/metadata/properties" xmlns:xsi="http://www.w3.org/2001/XMLSchema-instance" xmlns:pc="http://schemas.microsoft.com/office/infopath/2007/PartnerControls">
+  <documentManagement/>
+</p:properties>
 </file>
 
-<file path=customXml/itemProps2.xml><?xml version="1.0" encoding="utf-8"?>
+<file path=customXml/itemProps1.xml><?xml version="1.0" encoding="utf-8"?>
 <ds:datastoreItem xmlns:ds="http://schemas.openxmlformats.org/officeDocument/2006/customXml" ds:itemID="{767CD2D5-7A6C-47C3-9B54-C4225C74DD0B}">
   <ds:schemaRefs>
     <ds:schemaRef ds:uri="http://schemas.microsoft.com/office/2006/metadata/contentType"/>
@@ -9846,19 +11774,27 @@
 </ds:datastoreItem>
 </file>
 
+<file path=customXml/itemProps2.xml><?xml version="1.0" encoding="utf-8"?>
+<ds:datastoreItem xmlns:ds="http://schemas.openxmlformats.org/officeDocument/2006/customXml" ds:itemID="{6E8A10B9-B765-4F0B-A47F-7CB788CD8F65}">
+  <ds:schemaRefs>
+    <ds:schemaRef ds:uri="http://schemas.openxmlformats.org/officeDocument/2006/bibliography"/>
+  </ds:schemaRefs>
+</ds:datastoreItem>
+</file>
+
 <file path=customXml/itemProps3.xml><?xml version="1.0" encoding="utf-8"?>
+<ds:datastoreItem xmlns:ds="http://schemas.openxmlformats.org/officeDocument/2006/customXml" ds:itemID="{DABAA964-10BA-4DBC-ABF2-CDEAC0FAF7AA}">
+  <ds:schemaRefs>
+    <ds:schemaRef ds:uri="http://schemas.microsoft.com/sharepoint/v3/contenttype/forms"/>
+  </ds:schemaRefs>
+</ds:datastoreItem>
+</file>
+
+<file path=customXml/itemProps4.xml><?xml version="1.0" encoding="utf-8"?>
 <ds:datastoreItem xmlns:ds="http://schemas.openxmlformats.org/officeDocument/2006/customXml" ds:itemID="{5F1783E3-BA1C-4CA3-8E32-C9B378BBED03}">
   <ds:schemaRefs>
     <ds:schemaRef ds:uri="http://schemas.microsoft.com/office/2006/metadata/properties"/>
     <ds:schemaRef ds:uri="http://schemas.microsoft.com/office/infopath/2007/PartnerControls"/>
   </ds:schemaRefs>
 </ds:datastoreItem>
-</file>
-
-<file path=customXml/itemProps4.xml><?xml version="1.0" encoding="utf-8"?>
-<ds:datastoreItem xmlns:ds="http://schemas.openxmlformats.org/officeDocument/2006/customXml" ds:itemID="{DABAA964-10BA-4DBC-ABF2-CDEAC0FAF7AA}">
-  <ds:schemaRefs>
-    <ds:schemaRef ds:uri="http://schemas.microsoft.com/sharepoint/v3/contenttype/forms"/>
-  </ds:schemaRefs>
-</ds:datastoreItem>
 </file>
</xml_diff>

<commit_message>
agregado de competencias en documento 2.0 - benjamin nu
</commit_message>
<xml_diff>
--- a/Experiencia_1 - Planificación de proyecto/Actividad-1 - Autoevaluaciones_Grupo2/1.1_APT122_AutoevaluacionCompetenciasFase1 - benjamin nunez.docx
+++ b/Experiencia_1 - Planificación de proyecto/Actividad-1 - Autoevaluaciones_Grupo2/1.1_APT122_AutoevaluacionCompetenciasFase1 - benjamin nunez.docx
@@ -191,7 +191,23 @@
           <w:sz w:val="24"/>
           <w:szCs w:val="24"/>
         </w:rPr>
-        <w:t xml:space="preserve">Piensa en tu proceso de aprendizaje durante el tiempo que has estudiando en Duoc UC y evalúa el nivel de logro que alcanzaste en cada competencia de tu plan de estudio. </w:t>
+        <w:t xml:space="preserve">Piensa en tu proceso de aprendizaje durante el tiempo que has </w:t>
+      </w:r>
+      <w:r>
+        <w:rPr>
+          <w:rFonts w:eastAsiaTheme="majorEastAsia"/>
+          <w:sz w:val="24"/>
+          <w:szCs w:val="24"/>
+        </w:rPr>
+        <w:t>estudiado</w:t>
+      </w:r>
+      <w:r>
+        <w:rPr>
+          <w:rFonts w:eastAsiaTheme="majorEastAsia"/>
+          <w:sz w:val="24"/>
+          <w:szCs w:val="24"/>
+        </w:rPr>
+        <w:t xml:space="preserve"> en Duoc UC y evalúa el nivel de logro que alcanzaste en cada competencia de tu plan de estudio. </w:t>
       </w:r>
     </w:p>
     <w:p>
@@ -1330,25 +1346,7 @@
                 <w:sz w:val="18"/>
                 <w:szCs w:val="18"/>
               </w:rPr>
-              <w:t xml:space="preserve">Ofrecer propuestas de solución informática analizando de forma integral los procesos </w:t>
-            </w:r>
-            <w:r>
-              <w:rPr>
-                <w:b/>
-                <w:bCs/>
-                <w:sz w:val="18"/>
-                <w:szCs w:val="18"/>
-              </w:rPr>
-              <w:t>de acuerdo con</w:t>
-            </w:r>
-            <w:r>
-              <w:rPr>
-                <w:b/>
-                <w:bCs/>
-                <w:sz w:val="18"/>
-                <w:szCs w:val="18"/>
-              </w:rPr>
-              <w:t xml:space="preserve"> los</w:t>
+              <w:t>Ofrecer propuestas de solución informática analizando de forma integral los procesos de acuerdo con los</w:t>
             </w:r>
           </w:p>
           <w:p>
@@ -1405,6 +1403,15 @@
                 <w:szCs w:val="18"/>
               </w:rPr>
             </w:pPr>
+            <w:r>
+              <w:rPr>
+                <w:b/>
+                <w:bCs/>
+                <w:sz w:val="28"/>
+                <w:szCs w:val="28"/>
+              </w:rPr>
+              <w:t>x</w:t>
+            </w:r>
           </w:p>
         </w:tc>
         <w:tc>
@@ -1536,10 +1543,19 @@
               <w:rPr>
                 <w:b/>
                 <w:bCs/>
-                <w:sz w:val="18"/>
-                <w:szCs w:val="18"/>
-              </w:rPr>
-            </w:pPr>
+                <w:sz w:val="28"/>
+                <w:szCs w:val="28"/>
+              </w:rPr>
+            </w:pPr>
+            <w:r>
+              <w:rPr>
+                <w:b/>
+                <w:bCs/>
+                <w:sz w:val="28"/>
+                <w:szCs w:val="28"/>
+              </w:rPr>
+              <w:t>x</w:t>
+            </w:r>
           </w:p>
         </w:tc>
         <w:tc>
@@ -1674,6 +1690,15 @@
                 <w:szCs w:val="18"/>
               </w:rPr>
             </w:pPr>
+            <w:r>
+              <w:rPr>
+                <w:b/>
+                <w:bCs/>
+                <w:sz w:val="28"/>
+                <w:szCs w:val="28"/>
+              </w:rPr>
+              <w:t>x</w:t>
+            </w:r>
           </w:p>
         </w:tc>
         <w:tc>
@@ -1772,43 +1797,34 @@
                 <w:sz w:val="18"/>
                 <w:szCs w:val="18"/>
               </w:rPr>
-              <w:t xml:space="preserve">Programar consultas o rutinas para manipular información de una base de datos </w:t>
+              <w:t>Programar consultas o rutinas para manipular información de una base de datos de acuerdo con los requerimientos de la organización.</w:t>
             </w:r>
+          </w:p>
+        </w:tc>
+        <w:tc>
+          <w:tcPr>
+            <w:tcW w:w="1017" w:type="dxa"/>
+            <w:vAlign w:val="center"/>
+          </w:tcPr>
+          <w:p>
+            <w:pPr>
+              <w:jc w:val="center"/>
+              <w:rPr>
+                <w:b/>
+                <w:bCs/>
+                <w:sz w:val="18"/>
+                <w:szCs w:val="18"/>
+              </w:rPr>
+            </w:pPr>
             <w:r>
               <w:rPr>
                 <w:b/>
                 <w:bCs/>
-                <w:sz w:val="18"/>
-                <w:szCs w:val="18"/>
-              </w:rPr>
-              <w:t>de acuerdo con</w:t>
+                <w:sz w:val="28"/>
+                <w:szCs w:val="28"/>
+              </w:rPr>
+              <w:t>x</w:t>
             </w:r>
-            <w:r>
-              <w:rPr>
-                <w:b/>
-                <w:bCs/>
-                <w:sz w:val="18"/>
-                <w:szCs w:val="18"/>
-              </w:rPr>
-              <w:t xml:space="preserve"> los requerimientos de la organización.</w:t>
-            </w:r>
-          </w:p>
-        </w:tc>
-        <w:tc>
-          <w:tcPr>
-            <w:tcW w:w="1017" w:type="dxa"/>
-            <w:vAlign w:val="center"/>
-          </w:tcPr>
-          <w:p>
-            <w:pPr>
-              <w:jc w:val="center"/>
-              <w:rPr>
-                <w:b/>
-                <w:bCs/>
-                <w:sz w:val="18"/>
-                <w:szCs w:val="18"/>
-              </w:rPr>
-            </w:pPr>
           </w:p>
         </w:tc>
         <w:tc>
@@ -1987,6 +2003,15 @@
                 <w:szCs w:val="18"/>
               </w:rPr>
             </w:pPr>
+            <w:r>
+              <w:rPr>
+                <w:b/>
+                <w:bCs/>
+                <w:sz w:val="28"/>
+                <w:szCs w:val="28"/>
+              </w:rPr>
+              <w:t>x</w:t>
+            </w:r>
           </w:p>
         </w:tc>
         <w:tc>
@@ -2121,6 +2146,15 @@
                 <w:szCs w:val="18"/>
               </w:rPr>
             </w:pPr>
+            <w:r>
+              <w:rPr>
+                <w:b/>
+                <w:bCs/>
+                <w:sz w:val="28"/>
+                <w:szCs w:val="28"/>
+              </w:rPr>
+              <w:t>x</w:t>
+            </w:r>
           </w:p>
         </w:tc>
         <w:tc>
@@ -2255,6 +2289,15 @@
                 <w:szCs w:val="18"/>
               </w:rPr>
             </w:pPr>
+            <w:r>
+              <w:rPr>
+                <w:b/>
+                <w:bCs/>
+                <w:sz w:val="28"/>
+                <w:szCs w:val="28"/>
+              </w:rPr>
+              <w:t>x</w:t>
+            </w:r>
           </w:p>
         </w:tc>
         <w:tc>
@@ -2336,60 +2379,51 @@
                 <w:sz w:val="18"/>
                 <w:szCs w:val="18"/>
               </w:rPr>
-              <w:t xml:space="preserve">Implementar soluciones sistémicas integrales para automatizar u optimizar procesos de negocio </w:t>
+              <w:t>Implementar soluciones sistémicas integrales para automatizar u optimizar procesos de negocio de acuerdo con las necesidades de la organización.</w:t>
             </w:r>
+          </w:p>
+        </w:tc>
+        <w:tc>
+          <w:tcPr>
+            <w:tcW w:w="1017" w:type="dxa"/>
+            <w:vAlign w:val="center"/>
+          </w:tcPr>
+          <w:p>
+            <w:pPr>
+              <w:jc w:val="center"/>
+              <w:rPr>
+                <w:b/>
+                <w:bCs/>
+                <w:sz w:val="18"/>
+                <w:szCs w:val="18"/>
+              </w:rPr>
+            </w:pPr>
+          </w:p>
+        </w:tc>
+        <w:tc>
+          <w:tcPr>
+            <w:tcW w:w="926" w:type="dxa"/>
+            <w:vAlign w:val="center"/>
+          </w:tcPr>
+          <w:p>
+            <w:pPr>
+              <w:jc w:val="center"/>
+              <w:rPr>
+                <w:b/>
+                <w:bCs/>
+                <w:sz w:val="18"/>
+                <w:szCs w:val="18"/>
+              </w:rPr>
+            </w:pPr>
             <w:r>
               <w:rPr>
                 <w:b/>
                 <w:bCs/>
-                <w:sz w:val="18"/>
-                <w:szCs w:val="18"/>
-              </w:rPr>
-              <w:t>de acuerdo con</w:t>
+                <w:sz w:val="28"/>
+                <w:szCs w:val="28"/>
+              </w:rPr>
+              <w:t>x</w:t>
             </w:r>
-            <w:r>
-              <w:rPr>
-                <w:b/>
-                <w:bCs/>
-                <w:sz w:val="18"/>
-                <w:szCs w:val="18"/>
-              </w:rPr>
-              <w:t xml:space="preserve"> las necesidades de la organización.</w:t>
-            </w:r>
-          </w:p>
-        </w:tc>
-        <w:tc>
-          <w:tcPr>
-            <w:tcW w:w="1017" w:type="dxa"/>
-            <w:vAlign w:val="center"/>
-          </w:tcPr>
-          <w:p>
-            <w:pPr>
-              <w:jc w:val="center"/>
-              <w:rPr>
-                <w:b/>
-                <w:bCs/>
-                <w:sz w:val="18"/>
-                <w:szCs w:val="18"/>
-              </w:rPr>
-            </w:pPr>
-          </w:p>
-        </w:tc>
-        <w:tc>
-          <w:tcPr>
-            <w:tcW w:w="926" w:type="dxa"/>
-            <w:vAlign w:val="center"/>
-          </w:tcPr>
-          <w:p>
-            <w:pPr>
-              <w:jc w:val="center"/>
-              <w:rPr>
-                <w:b/>
-                <w:bCs/>
-                <w:sz w:val="18"/>
-                <w:szCs w:val="18"/>
-              </w:rPr>
-            </w:pPr>
           </w:p>
         </w:tc>
         <w:tc>
@@ -2541,6 +2575,15 @@
                 <w:szCs w:val="18"/>
               </w:rPr>
             </w:pPr>
+            <w:r>
+              <w:rPr>
+                <w:b/>
+                <w:bCs/>
+                <w:sz w:val="28"/>
+                <w:szCs w:val="28"/>
+              </w:rPr>
+              <w:t>x</w:t>
+            </w:r>
           </w:p>
         </w:tc>
         <w:tc>
@@ -2622,7 +2665,7 @@
                 <w:sz w:val="18"/>
                 <w:szCs w:val="18"/>
               </w:rPr>
-              <w:t>Gestionar proyectos informáticos, ofreciendo alternativas para la toma de decisiones de acuerdo a los requerimientos de la organización.</w:t>
+              <w:t>Gestionar proyectos informáticos, ofreciendo alternativas para la toma de decisiones de acuerdo con los requerimientos de la organización.</w:t>
             </w:r>
           </w:p>
         </w:tc>
@@ -2658,6 +2701,15 @@
                 <w:szCs w:val="18"/>
               </w:rPr>
             </w:pPr>
+            <w:r>
+              <w:rPr>
+                <w:b/>
+                <w:bCs/>
+                <w:sz w:val="28"/>
+                <w:szCs w:val="28"/>
+              </w:rPr>
+              <w:t>x</w:t>
+            </w:r>
           </w:p>
         </w:tc>
         <w:tc>
@@ -2756,43 +2808,34 @@
                 <w:sz w:val="18"/>
                 <w:szCs w:val="18"/>
               </w:rPr>
-              <w:t xml:space="preserve">Desarrollar la transformación de grandes volúmenes de datos para la obtención de información y conocimiento de la organización a fin de apoyar la toma de decisiones y la mejora de los procesos de negocio, </w:t>
+              <w:t>Desarrollar la transformación de grandes volúmenes de datos para la obtención de información y conocimiento de la organización a fin de apoyar la toma de decisiones y la mejora de los procesos de negocio, de acuerdo con las necesidades de la organización</w:t>
             </w:r>
+          </w:p>
+        </w:tc>
+        <w:tc>
+          <w:tcPr>
+            <w:tcW w:w="1017" w:type="dxa"/>
+            <w:vAlign w:val="center"/>
+          </w:tcPr>
+          <w:p>
+            <w:pPr>
+              <w:jc w:val="center"/>
+              <w:rPr>
+                <w:b/>
+                <w:bCs/>
+                <w:sz w:val="18"/>
+                <w:szCs w:val="18"/>
+              </w:rPr>
+            </w:pPr>
             <w:r>
               <w:rPr>
                 <w:b/>
                 <w:bCs/>
-                <w:sz w:val="18"/>
-                <w:szCs w:val="18"/>
-              </w:rPr>
-              <w:t>de acuerdo con</w:t>
+                <w:sz w:val="28"/>
+                <w:szCs w:val="28"/>
+              </w:rPr>
+              <w:t>x</w:t>
             </w:r>
-            <w:r>
-              <w:rPr>
-                <w:b/>
-                <w:bCs/>
-                <w:sz w:val="18"/>
-                <w:szCs w:val="18"/>
-              </w:rPr>
-              <w:t xml:space="preserve"> las necesidades de la organización</w:t>
-            </w:r>
-          </w:p>
-        </w:tc>
-        <w:tc>
-          <w:tcPr>
-            <w:tcW w:w="1017" w:type="dxa"/>
-            <w:vAlign w:val="center"/>
-          </w:tcPr>
-          <w:p>
-            <w:pPr>
-              <w:jc w:val="center"/>
-              <w:rPr>
-                <w:b/>
-                <w:bCs/>
-                <w:sz w:val="18"/>
-                <w:szCs w:val="18"/>
-              </w:rPr>
-            </w:pPr>
           </w:p>
         </w:tc>
         <w:tc>
@@ -2909,60 +2952,51 @@
                 <w:szCs w:val="18"/>
               </w:rPr>
               <w:lastRenderedPageBreak/>
-              <w:t xml:space="preserve">Resolver situaciones problemáticas de la vida cotidiana, educación superior y mundo laboral, utilizando operaciones básicas con números, expresiones algebraicas, razonamiento matemático básico y formas y espacio, </w:t>
+              <w:t>Resolver situaciones problemáticas de la vida cotidiana, educación superior y mundo laboral, utilizando operaciones básicas con números, expresiones algebraicas, razonamiento matemático básico y formas y espacio, de acuerdo con requerimientos.</w:t>
             </w:r>
+          </w:p>
+        </w:tc>
+        <w:tc>
+          <w:tcPr>
+            <w:tcW w:w="1017" w:type="dxa"/>
+            <w:vAlign w:val="center"/>
+          </w:tcPr>
+          <w:p>
+            <w:pPr>
+              <w:jc w:val="center"/>
+              <w:rPr>
+                <w:b/>
+                <w:bCs/>
+                <w:sz w:val="18"/>
+                <w:szCs w:val="18"/>
+              </w:rPr>
+            </w:pPr>
+          </w:p>
+        </w:tc>
+        <w:tc>
+          <w:tcPr>
+            <w:tcW w:w="926" w:type="dxa"/>
+            <w:vAlign w:val="center"/>
+          </w:tcPr>
+          <w:p>
+            <w:pPr>
+              <w:jc w:val="center"/>
+              <w:rPr>
+                <w:b/>
+                <w:bCs/>
+                <w:sz w:val="18"/>
+                <w:szCs w:val="18"/>
+              </w:rPr>
+            </w:pPr>
             <w:r>
               <w:rPr>
                 <w:b/>
                 <w:bCs/>
-                <w:sz w:val="18"/>
-                <w:szCs w:val="18"/>
-              </w:rPr>
-              <w:t>de acuerdo con</w:t>
+                <w:sz w:val="28"/>
+                <w:szCs w:val="28"/>
+              </w:rPr>
+              <w:t>x</w:t>
             </w:r>
-            <w:r>
-              <w:rPr>
-                <w:b/>
-                <w:bCs/>
-                <w:sz w:val="18"/>
-                <w:szCs w:val="18"/>
-              </w:rPr>
-              <w:t xml:space="preserve"> requerimientos.</w:t>
-            </w:r>
-          </w:p>
-        </w:tc>
-        <w:tc>
-          <w:tcPr>
-            <w:tcW w:w="1017" w:type="dxa"/>
-            <w:vAlign w:val="center"/>
-          </w:tcPr>
-          <w:p>
-            <w:pPr>
-              <w:jc w:val="center"/>
-              <w:rPr>
-                <w:b/>
-                <w:bCs/>
-                <w:sz w:val="18"/>
-                <w:szCs w:val="18"/>
-              </w:rPr>
-            </w:pPr>
-          </w:p>
-        </w:tc>
-        <w:tc>
-          <w:tcPr>
-            <w:tcW w:w="926" w:type="dxa"/>
-            <w:vAlign w:val="center"/>
-          </w:tcPr>
-          <w:p>
-            <w:pPr>
-              <w:jc w:val="center"/>
-              <w:rPr>
-                <w:b/>
-                <w:bCs/>
-                <w:sz w:val="18"/>
-                <w:szCs w:val="18"/>
-              </w:rPr>
-            </w:pPr>
           </w:p>
         </w:tc>
         <w:tc>
@@ -3061,77 +3095,68 @@
                 <w:sz w:val="18"/>
                 <w:szCs w:val="18"/>
               </w:rPr>
-              <w:t xml:space="preserve">Resolver situaciones problemáticas de la vida cotidiana, educación superior y mundo laboral, utilizando elementos de las matemáticas discretas y relaciones funcionales, </w:t>
+              <w:t>Resolver situaciones problemáticas de la vida cotidiana, educación superior y mundo laboral, utilizando elementos de las matemáticas discretas y relaciones funcionales, de acuerdo con requerimientos.</w:t>
             </w:r>
+          </w:p>
+        </w:tc>
+        <w:tc>
+          <w:tcPr>
+            <w:tcW w:w="1017" w:type="dxa"/>
+            <w:vAlign w:val="center"/>
+          </w:tcPr>
+          <w:p>
+            <w:pPr>
+              <w:jc w:val="center"/>
+              <w:rPr>
+                <w:b/>
+                <w:bCs/>
+                <w:sz w:val="18"/>
+                <w:szCs w:val="18"/>
+              </w:rPr>
+            </w:pPr>
+          </w:p>
+        </w:tc>
+        <w:tc>
+          <w:tcPr>
+            <w:tcW w:w="926" w:type="dxa"/>
+            <w:vAlign w:val="center"/>
+          </w:tcPr>
+          <w:p>
+            <w:pPr>
+              <w:jc w:val="center"/>
+              <w:rPr>
+                <w:b/>
+                <w:bCs/>
+                <w:sz w:val="18"/>
+                <w:szCs w:val="18"/>
+              </w:rPr>
+            </w:pPr>
+          </w:p>
+        </w:tc>
+        <w:tc>
+          <w:tcPr>
+            <w:tcW w:w="1055" w:type="dxa"/>
+            <w:vAlign w:val="center"/>
+          </w:tcPr>
+          <w:p>
+            <w:pPr>
+              <w:jc w:val="center"/>
+              <w:rPr>
+                <w:b/>
+                <w:bCs/>
+                <w:sz w:val="18"/>
+                <w:szCs w:val="18"/>
+              </w:rPr>
+            </w:pPr>
             <w:r>
               <w:rPr>
                 <w:b/>
                 <w:bCs/>
-                <w:sz w:val="18"/>
-                <w:szCs w:val="18"/>
-              </w:rPr>
-              <w:t>de acuerdo con</w:t>
+                <w:sz w:val="28"/>
+                <w:szCs w:val="28"/>
+              </w:rPr>
+              <w:t>x</w:t>
             </w:r>
-            <w:r>
-              <w:rPr>
-                <w:b/>
-                <w:bCs/>
-                <w:sz w:val="18"/>
-                <w:szCs w:val="18"/>
-              </w:rPr>
-              <w:t xml:space="preserve"> requerimientos.</w:t>
-            </w:r>
-          </w:p>
-        </w:tc>
-        <w:tc>
-          <w:tcPr>
-            <w:tcW w:w="1017" w:type="dxa"/>
-            <w:vAlign w:val="center"/>
-          </w:tcPr>
-          <w:p>
-            <w:pPr>
-              <w:jc w:val="center"/>
-              <w:rPr>
-                <w:b/>
-                <w:bCs/>
-                <w:sz w:val="18"/>
-                <w:szCs w:val="18"/>
-              </w:rPr>
-            </w:pPr>
-          </w:p>
-        </w:tc>
-        <w:tc>
-          <w:tcPr>
-            <w:tcW w:w="926" w:type="dxa"/>
-            <w:vAlign w:val="center"/>
-          </w:tcPr>
-          <w:p>
-            <w:pPr>
-              <w:jc w:val="center"/>
-              <w:rPr>
-                <w:b/>
-                <w:bCs/>
-                <w:sz w:val="18"/>
-                <w:szCs w:val="18"/>
-              </w:rPr>
-            </w:pPr>
-          </w:p>
-        </w:tc>
-        <w:tc>
-          <w:tcPr>
-            <w:tcW w:w="1055" w:type="dxa"/>
-            <w:vAlign w:val="center"/>
-          </w:tcPr>
-          <w:p>
-            <w:pPr>
-              <w:jc w:val="center"/>
-              <w:rPr>
-                <w:b/>
-                <w:bCs/>
-                <w:sz w:val="18"/>
-                <w:szCs w:val="18"/>
-              </w:rPr>
-            </w:pPr>
           </w:p>
         </w:tc>
         <w:tc>
@@ -3213,60 +3238,51 @@
                 <w:sz w:val="18"/>
                 <w:szCs w:val="18"/>
               </w:rPr>
-              <w:t xml:space="preserve">Resolver situaciones problemáticas de la educación superior y mundo laboral, utilizando elementos de la estadística descriptiva, </w:t>
+              <w:t>Resolver situaciones problemáticas de la educación superior y mundo laboral, utilizando elementos de la estadística descriptiva, de acuerdo con requerimientos.</w:t>
             </w:r>
+          </w:p>
+        </w:tc>
+        <w:tc>
+          <w:tcPr>
+            <w:tcW w:w="1017" w:type="dxa"/>
+            <w:vAlign w:val="center"/>
+          </w:tcPr>
+          <w:p>
+            <w:pPr>
+              <w:jc w:val="center"/>
+              <w:rPr>
+                <w:b/>
+                <w:bCs/>
+                <w:sz w:val="18"/>
+                <w:szCs w:val="18"/>
+              </w:rPr>
+            </w:pPr>
+          </w:p>
+        </w:tc>
+        <w:tc>
+          <w:tcPr>
+            <w:tcW w:w="926" w:type="dxa"/>
+            <w:vAlign w:val="center"/>
+          </w:tcPr>
+          <w:p>
+            <w:pPr>
+              <w:jc w:val="center"/>
+              <w:rPr>
+                <w:b/>
+                <w:bCs/>
+                <w:sz w:val="18"/>
+                <w:szCs w:val="18"/>
+              </w:rPr>
+            </w:pPr>
             <w:r>
               <w:rPr>
                 <w:b/>
                 <w:bCs/>
-                <w:sz w:val="18"/>
-                <w:szCs w:val="18"/>
-              </w:rPr>
-              <w:t>de acuerdo con</w:t>
+                <w:sz w:val="28"/>
+                <w:szCs w:val="28"/>
+              </w:rPr>
+              <w:t>x</w:t>
             </w:r>
-            <w:r>
-              <w:rPr>
-                <w:b/>
-                <w:bCs/>
-                <w:sz w:val="18"/>
-                <w:szCs w:val="18"/>
-              </w:rPr>
-              <w:t xml:space="preserve"> requerimientos.</w:t>
-            </w:r>
-          </w:p>
-        </w:tc>
-        <w:tc>
-          <w:tcPr>
-            <w:tcW w:w="1017" w:type="dxa"/>
-            <w:vAlign w:val="center"/>
-          </w:tcPr>
-          <w:p>
-            <w:pPr>
-              <w:jc w:val="center"/>
-              <w:rPr>
-                <w:b/>
-                <w:bCs/>
-                <w:sz w:val="18"/>
-                <w:szCs w:val="18"/>
-              </w:rPr>
-            </w:pPr>
-          </w:p>
-        </w:tc>
-        <w:tc>
-          <w:tcPr>
-            <w:tcW w:w="926" w:type="dxa"/>
-            <w:vAlign w:val="center"/>
-          </w:tcPr>
-          <w:p>
-            <w:pPr>
-              <w:jc w:val="center"/>
-              <w:rPr>
-                <w:b/>
-                <w:bCs/>
-                <w:sz w:val="18"/>
-                <w:szCs w:val="18"/>
-              </w:rPr>
-            </w:pPr>
           </w:p>
         </w:tc>
         <w:tc>
@@ -3365,7 +3381,7 @@
                 <w:sz w:val="18"/>
                 <w:szCs w:val="18"/>
               </w:rPr>
-              <w:t>Comunicar en forma oral o escrita, aplicando herramientas lingüístico-pragmáticas y estrategias de comprensión que permiten la solución de problemas comunicativos en los contextos académicos, de acuerdo al marco común de referencia de las lenguas.</w:t>
+              <w:t>Comunicar en forma oral o escrita, aplicando herramientas lingüístico-pragmáticas y estrategias de comprensión que permiten la solución de problemas comunicativos en los contextos académicos, de acuerdo con el marco común de referencia de las lenguas.</w:t>
             </w:r>
           </w:p>
         </w:tc>
@@ -3401,6 +3417,15 @@
                 <w:szCs w:val="18"/>
               </w:rPr>
             </w:pPr>
+            <w:r>
+              <w:rPr>
+                <w:b/>
+                <w:bCs/>
+                <w:sz w:val="28"/>
+                <w:szCs w:val="28"/>
+              </w:rPr>
+              <w:t>x</w:t>
+            </w:r>
           </w:p>
         </w:tc>
         <w:tc>
@@ -3499,25 +3524,7 @@
                 <w:sz w:val="18"/>
                 <w:szCs w:val="18"/>
               </w:rPr>
-              <w:t xml:space="preserve">Comunicarse de forma oral y escrita usando el idioma inglés en situaciones </w:t>
-            </w:r>
-            <w:r>
-              <w:rPr>
-                <w:b/>
-                <w:bCs/>
-                <w:sz w:val="18"/>
-                <w:szCs w:val="18"/>
-              </w:rPr>
-              <w:t>sociolaborales</w:t>
-            </w:r>
-            <w:r>
-              <w:rPr>
-                <w:b/>
-                <w:bCs/>
-                <w:sz w:val="18"/>
-                <w:szCs w:val="18"/>
-              </w:rPr>
-              <w:t xml:space="preserve"> a un nivel intermedio, según la Tabla de </w:t>
+              <w:t xml:space="preserve">Comunicarse de forma oral y escrita usando el idioma inglés en situaciones sociolaborales a un nivel intermedio, según la Tabla de </w:t>
             </w:r>
             <w:r>
               <w:rPr>
@@ -3546,6 +3553,16 @@
                 <w:szCs w:val="18"/>
               </w:rPr>
             </w:pPr>
+            <w:r>
+              <w:rPr>
+                <w:b/>
+                <w:bCs/>
+                <w:sz w:val="28"/>
+                <w:szCs w:val="28"/>
+              </w:rPr>
+              <w:lastRenderedPageBreak/>
+              <w:t>x</w:t>
+            </w:r>
           </w:p>
         </w:tc>
         <w:tc>
@@ -3680,6 +3697,15 @@
                 <w:szCs w:val="18"/>
               </w:rPr>
             </w:pPr>
+            <w:r>
+              <w:rPr>
+                <w:b/>
+                <w:bCs/>
+                <w:sz w:val="28"/>
+                <w:szCs w:val="28"/>
+              </w:rPr>
+              <w:t>x</w:t>
+            </w:r>
           </w:p>
         </w:tc>
         <w:tc>
@@ -3848,6 +3874,15 @@
                 <w:szCs w:val="18"/>
               </w:rPr>
             </w:pPr>
+            <w:r>
+              <w:rPr>
+                <w:b/>
+                <w:bCs/>
+                <w:sz w:val="28"/>
+                <w:szCs w:val="28"/>
+              </w:rPr>
+              <w:t>x</w:t>
+            </w:r>
           </w:p>
         </w:tc>
         <w:tc>
@@ -3929,7 +3964,7 @@
                 <w:sz w:val="18"/>
                 <w:szCs w:val="18"/>
               </w:rPr>
-              <w:t>Elaborar proyectos innovadores que agreguen valor a contextos sociales y productivos, de acuerdo a las necesidades del entorno.</w:t>
+              <w:t>Elaborar proyectos innovadores que agreguen valor a contextos sociales y productivos, de acuerdo con las necesidades del entorno.</w:t>
             </w:r>
           </w:p>
         </w:tc>
@@ -3982,6 +4017,15 @@
                 <w:szCs w:val="18"/>
               </w:rPr>
             </w:pPr>
+            <w:r>
+              <w:rPr>
+                <w:b/>
+                <w:bCs/>
+                <w:sz w:val="28"/>
+                <w:szCs w:val="28"/>
+              </w:rPr>
+              <w:t>x</w:t>
+            </w:r>
           </w:p>
         </w:tc>
         <w:tc>
@@ -4099,6 +4143,15 @@
                 <w:szCs w:val="18"/>
               </w:rPr>
             </w:pPr>
+            <w:r>
+              <w:rPr>
+                <w:b/>
+                <w:bCs/>
+                <w:sz w:val="28"/>
+                <w:szCs w:val="28"/>
+              </w:rPr>
+              <w:t>x</w:t>
+            </w:r>
           </w:p>
         </w:tc>
         <w:tc>
@@ -10306,6 +10359,7 @@
   <w:style w:type="character" w:default="1" w:styleId="Fuentedeprrafopredeter">
     <w:name w:val="Default Paragraph Font"/>
     <w:uiPriority w:val="1"/>
+    <w:semiHidden/>
     <w:unhideWhenUsed/>
   </w:style>
   <w:style w:type="table" w:default="1" w:styleId="Tablanormal">
@@ -11606,6 +11660,10 @@
 </file>
 
 <file path=customXml/item1.xml><?xml version="1.0" encoding="utf-8"?>
+<b:Sources xmlns:b="http://schemas.openxmlformats.org/officeDocument/2006/bibliography" xmlns="http://schemas.openxmlformats.org/officeDocument/2006/bibliography" SelectedStyle="\APASixthEditionOfficeOnline.xsl" StyleName="APA" Version="6"/>
+</file>
+
+<file path=customXml/item2.xml><?xml version="1.0" encoding="utf-8"?>
 <ct:contentTypeSchema xmlns:ct="http://schemas.microsoft.com/office/2006/metadata/contentType" xmlns:ma="http://schemas.microsoft.com/office/2006/metadata/properties/metaAttributes" ct:_="" ma:_="" ma:contentTypeName="Documento" ma:contentTypeID="0x010100E96778489EE7714D8BD12CC105EB918B" ma:contentTypeVersion="2" ma:contentTypeDescription="Crear nuevo documento." ma:contentTypeScope="" ma:versionID="416c5c7ae9b5d54d83875cd3c65194e3">
   <xsd:schema xmlns:xsd="http://www.w3.org/2001/XMLSchema" xmlns:xs="http://www.w3.org/2001/XMLSchema" xmlns:p="http://schemas.microsoft.com/office/2006/metadata/properties" xmlns:ns2="126e8a1c-9ea9-435a-ac89-d06c80d62e30" targetNamespace="http://schemas.microsoft.com/office/2006/metadata/properties" ma:root="true" ma:fieldsID="70a237c842677bd850644f8595079f5e" ns2:_="">
     <xsd:import namespace="126e8a1c-9ea9-435a-ac89-d06c80d62e30"/>
@@ -11737,11 +11795,13 @@
 </ct:contentTypeSchema>
 </file>
 
-<file path=customXml/item2.xml><?xml version="1.0" encoding="utf-8"?>
-<b:Sources xmlns:b="http://schemas.openxmlformats.org/officeDocument/2006/bibliography" xmlns="http://schemas.openxmlformats.org/officeDocument/2006/bibliography" SelectedStyle="\APASixthEditionOfficeOnline.xsl" StyleName="APA" Version="6"/>
+<file path=customXml/item3.xml><?xml version="1.0" encoding="utf-8"?>
+<p:properties xmlns:p="http://schemas.microsoft.com/office/2006/metadata/properties" xmlns:xsi="http://www.w3.org/2001/XMLSchema-instance" xmlns:pc="http://schemas.microsoft.com/office/infopath/2007/PartnerControls">
+  <documentManagement/>
+</p:properties>
 </file>
 
-<file path=customXml/item3.xml><?xml version="1.0" encoding="utf-8"?>
+<file path=customXml/item4.xml><?xml version="1.0" encoding="utf-8"?>
 <?mso-contentType ?>
 <FormTemplates xmlns="http://schemas.microsoft.com/sharepoint/v3/contenttype/forms">
   <Display>DocumentLibraryForm</Display>
@@ -11750,13 +11810,15 @@
 </FormTemplates>
 </file>
 
-<file path=customXml/item4.xml><?xml version="1.0" encoding="utf-8"?>
-<p:properties xmlns:p="http://schemas.microsoft.com/office/2006/metadata/properties" xmlns:xsi="http://www.w3.org/2001/XMLSchema-instance" xmlns:pc="http://schemas.microsoft.com/office/infopath/2007/PartnerControls">
-  <documentManagement/>
-</p:properties>
+<file path=customXml/itemProps1.xml><?xml version="1.0" encoding="utf-8"?>
+<ds:datastoreItem xmlns:ds="http://schemas.openxmlformats.org/officeDocument/2006/customXml" ds:itemID="{6E8A10B9-B765-4F0B-A47F-7CB788CD8F65}">
+  <ds:schemaRefs>
+    <ds:schemaRef ds:uri="http://schemas.openxmlformats.org/officeDocument/2006/bibliography"/>
+  </ds:schemaRefs>
+</ds:datastoreItem>
 </file>
 
-<file path=customXml/itemProps1.xml><?xml version="1.0" encoding="utf-8"?>
+<file path=customXml/itemProps2.xml><?xml version="1.0" encoding="utf-8"?>
 <ds:datastoreItem xmlns:ds="http://schemas.openxmlformats.org/officeDocument/2006/customXml" ds:itemID="{767CD2D5-7A6C-47C3-9B54-C4225C74DD0B}">
   <ds:schemaRefs>
     <ds:schemaRef ds:uri="http://schemas.microsoft.com/office/2006/metadata/contentType"/>
@@ -11774,27 +11836,19 @@
 </ds:datastoreItem>
 </file>
 
-<file path=customXml/itemProps2.xml><?xml version="1.0" encoding="utf-8"?>
-<ds:datastoreItem xmlns:ds="http://schemas.openxmlformats.org/officeDocument/2006/customXml" ds:itemID="{6E8A10B9-B765-4F0B-A47F-7CB788CD8F65}">
-  <ds:schemaRefs>
-    <ds:schemaRef ds:uri="http://schemas.openxmlformats.org/officeDocument/2006/bibliography"/>
-  </ds:schemaRefs>
-</ds:datastoreItem>
-</file>
-
 <file path=customXml/itemProps3.xml><?xml version="1.0" encoding="utf-8"?>
-<ds:datastoreItem xmlns:ds="http://schemas.openxmlformats.org/officeDocument/2006/customXml" ds:itemID="{DABAA964-10BA-4DBC-ABF2-CDEAC0FAF7AA}">
-  <ds:schemaRefs>
-    <ds:schemaRef ds:uri="http://schemas.microsoft.com/sharepoint/v3/contenttype/forms"/>
-  </ds:schemaRefs>
-</ds:datastoreItem>
-</file>
-
-<file path=customXml/itemProps4.xml><?xml version="1.0" encoding="utf-8"?>
 <ds:datastoreItem xmlns:ds="http://schemas.openxmlformats.org/officeDocument/2006/customXml" ds:itemID="{5F1783E3-BA1C-4CA3-8E32-C9B378BBED03}">
   <ds:schemaRefs>
     <ds:schemaRef ds:uri="http://schemas.microsoft.com/office/2006/metadata/properties"/>
     <ds:schemaRef ds:uri="http://schemas.microsoft.com/office/infopath/2007/PartnerControls"/>
   </ds:schemaRefs>
 </ds:datastoreItem>
+</file>
+
+<file path=customXml/itemProps4.xml><?xml version="1.0" encoding="utf-8"?>
+<ds:datastoreItem xmlns:ds="http://schemas.openxmlformats.org/officeDocument/2006/customXml" ds:itemID="{DABAA964-10BA-4DBC-ABF2-CDEAC0FAF7AA}">
+  <ds:schemaRefs>
+    <ds:schemaRef ds:uri="http://schemas.microsoft.com/sharepoint/v3/contenttype/forms"/>
+  </ds:schemaRefs>
+</ds:datastoreItem>
 </file>
</xml_diff>

<commit_message>
agregado de competencias en documento 3.0 - benjamin nu
</commit_message>
<xml_diff>
--- a/Experiencia_1 - Planificación de proyecto/Actividad-1 - Autoevaluaciones_Grupo2/1.1_APT122_AutoevaluacionCompetenciasFase1 - benjamin nunez.docx
+++ b/Experiencia_1 - Planificación de proyecto/Actividad-1 - Autoevaluaciones_Grupo2/1.1_APT122_AutoevaluacionCompetenciasFase1 - benjamin nunez.docx
@@ -1326,6 +1326,39 @@
         </w:trPr>
         <w:tc>
           <w:tcPr>
+            <w:tcW w:w="9923" w:type="dxa"/>
+            <w:gridSpan w:val="7"/>
+            <w:vAlign w:val="center"/>
+          </w:tcPr>
+          <w:p>
+            <w:pPr>
+              <w:jc w:val="center"/>
+              <w:rPr>
+                <w:b/>
+                <w:bCs/>
+                <w:sz w:val="24"/>
+                <w:szCs w:val="24"/>
+              </w:rPr>
+            </w:pPr>
+            <w:r>
+              <w:rPr>
+                <w:b/>
+                <w:bCs/>
+                <w:sz w:val="24"/>
+                <w:szCs w:val="24"/>
+              </w:rPr>
+              <w:t>Competencias técnicas</w:t>
+            </w:r>
+          </w:p>
+        </w:tc>
+      </w:tr>
+      <w:tr>
+        <w:trPr>
+          <w:trHeight w:val="591"/>
+          <w:jc w:val="center"/>
+        </w:trPr>
+        <w:tc>
+          <w:tcPr>
             <w:tcW w:w="1931" w:type="dxa"/>
             <w:vAlign w:val="center"/>
           </w:tcPr>
@@ -1940,7 +1973,7 @@
                 <w:sz w:val="18"/>
                 <w:szCs w:val="18"/>
               </w:rPr>
-              <w:t xml:space="preserve">Construir programas y rutinas de variada complejidad para dar solución a requerimientos de la organización, acordes a tecnologías de mercado y utilizando </w:t>
+              <w:t xml:space="preserve">Construir programas y rutinas de variada complejidad para dar solución a requerimientos de la organización, acordes </w:t>
             </w:r>
             <w:r>
               <w:rPr>
@@ -1950,7 +1983,7 @@
                 <w:szCs w:val="18"/>
               </w:rPr>
               <w:lastRenderedPageBreak/>
-              <w:t>buenas prácticas de codificación.</w:t>
+              <w:t>a tecnologías de mercado y utilizando buenas prácticas de codificación.</w:t>
             </w:r>
           </w:p>
         </w:tc>
@@ -2931,7 +2964,8 @@
         </w:trPr>
         <w:tc>
           <w:tcPr>
-            <w:tcW w:w="1931" w:type="dxa"/>
+            <w:tcW w:w="9923" w:type="dxa"/>
+            <w:gridSpan w:val="7"/>
             <w:vAlign w:val="center"/>
           </w:tcPr>
           <w:p>
@@ -2948,123 +2982,21 @@
               <w:rPr>
                 <w:b/>
                 <w:bCs/>
-                <w:sz w:val="18"/>
-                <w:szCs w:val="18"/>
+                <w:sz w:val="24"/>
+                <w:szCs w:val="24"/>
               </w:rPr>
               <w:lastRenderedPageBreak/>
-              <w:t>Resolver situaciones problemáticas de la vida cotidiana, educación superior y mundo laboral, utilizando operaciones básicas con números, expresiones algebraicas, razonamiento matemático básico y formas y espacio, de acuerdo con requerimientos.</w:t>
+              <w:t xml:space="preserve">Competencias </w:t>
             </w:r>
-          </w:p>
-        </w:tc>
-        <w:tc>
-          <w:tcPr>
-            <w:tcW w:w="1017" w:type="dxa"/>
-            <w:vAlign w:val="center"/>
-          </w:tcPr>
-          <w:p>
-            <w:pPr>
-              <w:jc w:val="center"/>
-              <w:rPr>
-                <w:b/>
-                <w:bCs/>
-                <w:sz w:val="18"/>
-                <w:szCs w:val="18"/>
-              </w:rPr>
-            </w:pPr>
-          </w:p>
-        </w:tc>
-        <w:tc>
-          <w:tcPr>
-            <w:tcW w:w="926" w:type="dxa"/>
-            <w:vAlign w:val="center"/>
-          </w:tcPr>
-          <w:p>
-            <w:pPr>
-              <w:jc w:val="center"/>
-              <w:rPr>
-                <w:b/>
-                <w:bCs/>
-                <w:sz w:val="18"/>
-                <w:szCs w:val="18"/>
-              </w:rPr>
-            </w:pPr>
             <w:r>
               <w:rPr>
                 <w:b/>
                 <w:bCs/>
-                <w:sz w:val="28"/>
-                <w:szCs w:val="28"/>
-              </w:rPr>
-              <w:t>x</w:t>
+                <w:sz w:val="24"/>
+                <w:szCs w:val="24"/>
+              </w:rPr>
+              <w:t>Genéricas</w:t>
             </w:r>
-          </w:p>
-        </w:tc>
-        <w:tc>
-          <w:tcPr>
-            <w:tcW w:w="1055" w:type="dxa"/>
-            <w:vAlign w:val="center"/>
-          </w:tcPr>
-          <w:p>
-            <w:pPr>
-              <w:jc w:val="center"/>
-              <w:rPr>
-                <w:b/>
-                <w:bCs/>
-                <w:sz w:val="18"/>
-                <w:szCs w:val="18"/>
-              </w:rPr>
-            </w:pPr>
-          </w:p>
-        </w:tc>
-        <w:tc>
-          <w:tcPr>
-            <w:tcW w:w="1187" w:type="dxa"/>
-            <w:vAlign w:val="center"/>
-          </w:tcPr>
-          <w:p>
-            <w:pPr>
-              <w:jc w:val="center"/>
-              <w:rPr>
-                <w:b/>
-                <w:bCs/>
-                <w:sz w:val="18"/>
-                <w:szCs w:val="18"/>
-              </w:rPr>
-            </w:pPr>
-          </w:p>
-        </w:tc>
-        <w:tc>
-          <w:tcPr>
-            <w:tcW w:w="1250" w:type="dxa"/>
-            <w:vAlign w:val="center"/>
-          </w:tcPr>
-          <w:p>
-            <w:pPr>
-              <w:jc w:val="center"/>
-              <w:rPr>
-                <w:b/>
-                <w:bCs/>
-                <w:sz w:val="18"/>
-                <w:szCs w:val="18"/>
-              </w:rPr>
-            </w:pPr>
-          </w:p>
-        </w:tc>
-        <w:tc>
-          <w:tcPr>
-            <w:tcW w:w="2557" w:type="dxa"/>
-            <w:vAlign w:val="center"/>
-          </w:tcPr>
-          <w:p>
-            <w:pPr>
-              <w:jc w:val="center"/>
-              <w:rPr>
-                <w:b/>
-                <w:bCs/>
-                <w:sz w:val="18"/>
-                <w:szCs w:val="18"/>
-              </w:rPr>
-            </w:pPr>
           </w:p>
         </w:tc>
       </w:tr>
@@ -3095,7 +3027,7 @@
                 <w:sz w:val="18"/>
                 <w:szCs w:val="18"/>
               </w:rPr>
-              <w:t>Resolver situaciones problemáticas de la vida cotidiana, educación superior y mundo laboral, utilizando elementos de las matemáticas discretas y relaciones funcionales, de acuerdo con requerimientos.</w:t>
+              <w:t>Resolver situaciones problemáticas de la vida cotidiana, educación superior y mundo laboral, utilizando operaciones básicas con números, expresiones algebraicas, razonamiento matemático básico y formas y espacio, de acuerdo con requerimientos.</w:t>
             </w:r>
           </w:p>
         </w:tc>
@@ -3119,23 +3051,6 @@
         <w:tc>
           <w:tcPr>
             <w:tcW w:w="926" w:type="dxa"/>
-            <w:vAlign w:val="center"/>
-          </w:tcPr>
-          <w:p>
-            <w:pPr>
-              <w:jc w:val="center"/>
-              <w:rPr>
-                <w:b/>
-                <w:bCs/>
-                <w:sz w:val="18"/>
-                <w:szCs w:val="18"/>
-              </w:rPr>
-            </w:pPr>
-          </w:p>
-        </w:tc>
-        <w:tc>
-          <w:tcPr>
-            <w:tcW w:w="1055" w:type="dxa"/>
             <w:vAlign w:val="center"/>
           </w:tcPr>
           <w:p>
@@ -3157,6 +3072,23 @@
               </w:rPr>
               <w:t>x</w:t>
             </w:r>
+          </w:p>
+        </w:tc>
+        <w:tc>
+          <w:tcPr>
+            <w:tcW w:w="1055" w:type="dxa"/>
+            <w:vAlign w:val="center"/>
+          </w:tcPr>
+          <w:p>
+            <w:pPr>
+              <w:jc w:val="center"/>
+              <w:rPr>
+                <w:b/>
+                <w:bCs/>
+                <w:sz w:val="18"/>
+                <w:szCs w:val="18"/>
+              </w:rPr>
+            </w:pPr>
           </w:p>
         </w:tc>
         <w:tc>
@@ -3238,7 +3170,7 @@
                 <w:sz w:val="18"/>
                 <w:szCs w:val="18"/>
               </w:rPr>
-              <w:t>Resolver situaciones problemáticas de la educación superior y mundo laboral, utilizando elementos de la estadística descriptiva, de acuerdo con requerimientos.</w:t>
+              <w:t>Resolver situaciones problemáticas de la vida cotidiana, educación superior y mundo laboral, utilizando elementos de las matemáticas discretas y relaciones funcionales, de acuerdo con requerimientos.</w:t>
             </w:r>
           </w:p>
         </w:tc>
@@ -3262,6 +3194,23 @@
         <w:tc>
           <w:tcPr>
             <w:tcW w:w="926" w:type="dxa"/>
+            <w:vAlign w:val="center"/>
+          </w:tcPr>
+          <w:p>
+            <w:pPr>
+              <w:jc w:val="center"/>
+              <w:rPr>
+                <w:b/>
+                <w:bCs/>
+                <w:sz w:val="18"/>
+                <w:szCs w:val="18"/>
+              </w:rPr>
+            </w:pPr>
+          </w:p>
+        </w:tc>
+        <w:tc>
+          <w:tcPr>
+            <w:tcW w:w="1055" w:type="dxa"/>
             <w:vAlign w:val="center"/>
           </w:tcPr>
           <w:p>
@@ -3283,23 +3232,6 @@
               </w:rPr>
               <w:t>x</w:t>
             </w:r>
-          </w:p>
-        </w:tc>
-        <w:tc>
-          <w:tcPr>
-            <w:tcW w:w="1055" w:type="dxa"/>
-            <w:vAlign w:val="center"/>
-          </w:tcPr>
-          <w:p>
-            <w:pPr>
-              <w:jc w:val="center"/>
-              <w:rPr>
-                <w:b/>
-                <w:bCs/>
-                <w:sz w:val="18"/>
-                <w:szCs w:val="18"/>
-              </w:rPr>
-            </w:pPr>
           </w:p>
         </w:tc>
         <w:tc>
@@ -3381,7 +3313,7 @@
                 <w:sz w:val="18"/>
                 <w:szCs w:val="18"/>
               </w:rPr>
-              <w:t>Comunicar en forma oral o escrita, aplicando herramientas lingüístico-pragmáticas y estrategias de comprensión que permiten la solución de problemas comunicativos en los contextos académicos, de acuerdo con el marco común de referencia de las lenguas.</w:t>
+              <w:t>Resolver situaciones problemáticas de la educación superior y mundo laboral, utilizando elementos de la estadística descriptiva, de acuerdo con requerimientos.</w:t>
             </w:r>
           </w:p>
         </w:tc>
@@ -3524,7 +3456,150 @@
                 <w:sz w:val="18"/>
                 <w:szCs w:val="18"/>
               </w:rPr>
-              <w:t xml:space="preserve">Comunicarse de forma oral y escrita usando el idioma inglés en situaciones sociolaborales a un nivel intermedio, según la Tabla de </w:t>
+              <w:t>Comunicar en forma oral o escrita, aplicando herramientas lingüístico-pragmáticas y estrategias de comprensión que permiten la solución de problemas comunicativos en los contextos académicos, de acuerdo con el marco común de referencia de las lenguas.</w:t>
+            </w:r>
+          </w:p>
+        </w:tc>
+        <w:tc>
+          <w:tcPr>
+            <w:tcW w:w="1017" w:type="dxa"/>
+            <w:vAlign w:val="center"/>
+          </w:tcPr>
+          <w:p>
+            <w:pPr>
+              <w:jc w:val="center"/>
+              <w:rPr>
+                <w:b/>
+                <w:bCs/>
+                <w:sz w:val="18"/>
+                <w:szCs w:val="18"/>
+              </w:rPr>
+            </w:pPr>
+          </w:p>
+        </w:tc>
+        <w:tc>
+          <w:tcPr>
+            <w:tcW w:w="926" w:type="dxa"/>
+            <w:vAlign w:val="center"/>
+          </w:tcPr>
+          <w:p>
+            <w:pPr>
+              <w:jc w:val="center"/>
+              <w:rPr>
+                <w:b/>
+                <w:bCs/>
+                <w:sz w:val="18"/>
+                <w:szCs w:val="18"/>
+              </w:rPr>
+            </w:pPr>
+            <w:r>
+              <w:rPr>
+                <w:b/>
+                <w:bCs/>
+                <w:sz w:val="28"/>
+                <w:szCs w:val="28"/>
+              </w:rPr>
+              <w:t>x</w:t>
+            </w:r>
+          </w:p>
+        </w:tc>
+        <w:tc>
+          <w:tcPr>
+            <w:tcW w:w="1055" w:type="dxa"/>
+            <w:vAlign w:val="center"/>
+          </w:tcPr>
+          <w:p>
+            <w:pPr>
+              <w:jc w:val="center"/>
+              <w:rPr>
+                <w:b/>
+                <w:bCs/>
+                <w:sz w:val="18"/>
+                <w:szCs w:val="18"/>
+              </w:rPr>
+            </w:pPr>
+          </w:p>
+        </w:tc>
+        <w:tc>
+          <w:tcPr>
+            <w:tcW w:w="1187" w:type="dxa"/>
+            <w:vAlign w:val="center"/>
+          </w:tcPr>
+          <w:p>
+            <w:pPr>
+              <w:jc w:val="center"/>
+              <w:rPr>
+                <w:b/>
+                <w:bCs/>
+                <w:sz w:val="18"/>
+                <w:szCs w:val="18"/>
+              </w:rPr>
+            </w:pPr>
+          </w:p>
+        </w:tc>
+        <w:tc>
+          <w:tcPr>
+            <w:tcW w:w="1250" w:type="dxa"/>
+            <w:vAlign w:val="center"/>
+          </w:tcPr>
+          <w:p>
+            <w:pPr>
+              <w:jc w:val="center"/>
+              <w:rPr>
+                <w:b/>
+                <w:bCs/>
+                <w:sz w:val="18"/>
+                <w:szCs w:val="18"/>
+              </w:rPr>
+            </w:pPr>
+          </w:p>
+        </w:tc>
+        <w:tc>
+          <w:tcPr>
+            <w:tcW w:w="2557" w:type="dxa"/>
+            <w:vAlign w:val="center"/>
+          </w:tcPr>
+          <w:p>
+            <w:pPr>
+              <w:jc w:val="center"/>
+              <w:rPr>
+                <w:b/>
+                <w:bCs/>
+                <w:sz w:val="18"/>
+                <w:szCs w:val="18"/>
+              </w:rPr>
+            </w:pPr>
+          </w:p>
+        </w:tc>
+      </w:tr>
+      <w:tr>
+        <w:trPr>
+          <w:trHeight w:val="576"/>
+          <w:jc w:val="center"/>
+        </w:trPr>
+        <w:tc>
+          <w:tcPr>
+            <w:tcW w:w="1931" w:type="dxa"/>
+            <w:vAlign w:val="center"/>
+          </w:tcPr>
+          <w:p>
+            <w:pPr>
+              <w:jc w:val="center"/>
+              <w:rPr>
+                <w:b/>
+                <w:bCs/>
+                <w:sz w:val="18"/>
+                <w:szCs w:val="18"/>
+              </w:rPr>
+            </w:pPr>
+            <w:r>
+              <w:rPr>
+                <w:b/>
+                <w:bCs/>
+                <w:sz w:val="18"/>
+                <w:szCs w:val="18"/>
+              </w:rPr>
+              <w:t xml:space="preserve">Comunicarse de forma oral y escrita usando el idioma inglés en situaciones sociolaborales a un </w:t>
             </w:r>
             <w:r>
               <w:rPr>
@@ -3534,7 +3609,7 @@
                 <w:szCs w:val="18"/>
               </w:rPr>
               <w:lastRenderedPageBreak/>
-              <w:t>Competencias TOEIC y CEFR.</w:t>
+              <w:t>nivel intermedio, según la Tabla de Competencias TOEIC y CEFR.</w:t>
             </w:r>
           </w:p>
         </w:tc>

</xml_diff>

<commit_message>
documento benja al 80%
</commit_message>
<xml_diff>
--- a/Experiencia_1 - Planificación de proyecto/Actividad-1 - Autoevaluaciones_Grupo2/1.1_APT122_AutoevaluacionCompetenciasFase1 - benjamin nunez.docx
+++ b/Experiencia_1 - Planificación de proyecto/Actividad-1 - Autoevaluaciones_Grupo2/1.1_APT122_AutoevaluacionCompetenciasFase1 - benjamin nunez.docx
@@ -1513,6 +1513,15 @@
                 <w:szCs w:val="18"/>
               </w:rPr>
             </w:pPr>
+            <w:r>
+              <w:rPr>
+                <w:b/>
+                <w:bCs/>
+                <w:sz w:val="18"/>
+                <w:szCs w:val="18"/>
+              </w:rPr>
+              <w:t>Esto lo puedo justificar mediante mi logro en la asignatura de BPM, debido a que tuve que analizar procesos ya existentes dentro de una organización y, en base a ello, proporcionar una alternativa conforme a los estándares tecnológicos actuales.</w:t>
+            </w:r>
           </w:p>
         </w:tc>
       </w:tr>
@@ -1657,6 +1666,24 @@
                 <w:szCs w:val="18"/>
               </w:rPr>
             </w:pPr>
+            <w:r>
+              <w:rPr>
+                <w:b/>
+                <w:bCs/>
+                <w:sz w:val="18"/>
+                <w:szCs w:val="18"/>
+              </w:rPr>
+              <w:t>A lo largo de estos años, he explorado diversas técnicas de desarrollo de software, abarcando soluciones web, móviles y de escritorio. También he trabajado con procesos ETL y desarrollo en la nube, reconociendo su gran relevancia actual. Sin embargo, he abordado estos temas de forma general, sin profundizar de manera exhaustiva en</w:t>
+            </w:r>
+            <w:r>
+              <w:rPr>
+                <w:b/>
+                <w:bCs/>
+                <w:sz w:val="18"/>
+                <w:szCs w:val="18"/>
+              </w:rPr>
+              <w:t xml:space="preserve"> una sola tecnología en particular.</w:t>
+            </w:r>
           </w:p>
         </w:tc>
       </w:tr>
@@ -1800,6 +1827,15 @@
                 <w:szCs w:val="18"/>
               </w:rPr>
             </w:pPr>
+            <w:r>
+              <w:rPr>
+                <w:b/>
+                <w:bCs/>
+                <w:sz w:val="18"/>
+                <w:szCs w:val="18"/>
+              </w:rPr>
+              <w:t>Puedo decir que poseo conocimientos relacionados con el modelado de bases de datos, así como del modelo entidad-relación necesario para su correcto funcionamiento. Este aprendizaje fue mi punto de partida para adentrarme en el manejo de datos mediante Oracle Data Modeler.</w:t>
+            </w:r>
           </w:p>
         </w:tc>
       </w:tr>
@@ -1830,7 +1866,17 @@
                 <w:sz w:val="18"/>
                 <w:szCs w:val="18"/>
               </w:rPr>
-              <w:t>Programar consultas o rutinas para manipular información de una base de datos de acuerdo con los requerimientos de la organización.</w:t>
+              <w:t xml:space="preserve">Programar consultas o rutinas para manipular información de una </w:t>
+            </w:r>
+            <w:r>
+              <w:rPr>
+                <w:b/>
+                <w:bCs/>
+                <w:sz w:val="18"/>
+                <w:szCs w:val="18"/>
+              </w:rPr>
+              <w:lastRenderedPageBreak/>
+              <w:t>base de datos de acuerdo con los requerimientos de la organización.</w:t>
             </w:r>
           </w:p>
         </w:tc>
@@ -1856,6 +1902,7 @@
                 <w:sz w:val="28"/>
                 <w:szCs w:val="28"/>
               </w:rPr>
+              <w:lastRenderedPageBreak/>
               <w:t>x</w:t>
             </w:r>
           </w:p>
@@ -1943,6 +1990,25 @@
                 <w:szCs w:val="18"/>
               </w:rPr>
             </w:pPr>
+            <w:r>
+              <w:rPr>
+                <w:b/>
+                <w:bCs/>
+                <w:sz w:val="18"/>
+                <w:szCs w:val="18"/>
+              </w:rPr>
+              <w:t xml:space="preserve">A su vez, después de diseñar la base de datos, tuve que aprender cómo visualizar la </w:t>
+            </w:r>
+            <w:r>
+              <w:rPr>
+                <w:b/>
+                <w:bCs/>
+                <w:sz w:val="18"/>
+                <w:szCs w:val="18"/>
+              </w:rPr>
+              <w:lastRenderedPageBreak/>
+              <w:t>información y desarrollar consultas que me permitieran resolver o modificar las problemáticas propuestas. Además, aprendí a crear y utilizar vistas y procedimientos almacenados utilizando PL/SQL.</w:t>
+            </w:r>
           </w:p>
         </w:tc>
       </w:tr>
@@ -1973,17 +2039,8 @@
                 <w:sz w:val="18"/>
                 <w:szCs w:val="18"/>
               </w:rPr>
-              <w:t xml:space="preserve">Construir programas y rutinas de variada complejidad para dar solución a requerimientos de la organización, acordes </w:t>
-            </w:r>
-            <w:r>
-              <w:rPr>
-                <w:b/>
-                <w:bCs/>
-                <w:sz w:val="18"/>
-                <w:szCs w:val="18"/>
-              </w:rPr>
               <w:lastRenderedPageBreak/>
-              <w:t>a tecnologías de mercado y utilizando buenas prácticas de codificación.</w:t>
+              <w:t>Construir programas y rutinas de variada complejidad para dar solución a requerimientos de la organización, acordes a tecnologías de mercado y utilizando buenas prácticas de codificación.</w:t>
             </w:r>
           </w:p>
         </w:tc>
@@ -2096,6 +2153,15 @@
                 <w:szCs w:val="18"/>
               </w:rPr>
             </w:pPr>
+            <w:r>
+              <w:rPr>
+                <w:b/>
+                <w:bCs/>
+                <w:sz w:val="18"/>
+                <w:szCs w:val="18"/>
+              </w:rPr>
+              <w:t>En cada asignatura adquirí conocimiento sobre las tecnologías que tenían mayor peso en el mercado en ese momento. Sin embargo, entiendo que esto puede variar en la actualidad, ya que la tecnología avanza sin parar y constantemente se generan nuevos estándares.</w:t>
+            </w:r>
           </w:p>
         </w:tc>
       </w:tr>
@@ -2239,6 +2305,15 @@
                 <w:szCs w:val="18"/>
               </w:rPr>
             </w:pPr>
+            <w:r>
+              <w:rPr>
+                <w:b/>
+                <w:bCs/>
+                <w:sz w:val="18"/>
+                <w:szCs w:val="18"/>
+              </w:rPr>
+              <w:t>Cursé la asignatura de Calidad de Software junto con Ciberseguridad, lo cual potenció mi uso de herramientas de prueba como ZAP y Cypress. Además, adquirí los conocimientos necesarios para diseñar y documentar un plan de pruebas efectivo.</w:t>
+            </w:r>
           </w:p>
         </w:tc>
       </w:tr>
@@ -2382,6 +2457,15 @@
                 <w:szCs w:val="18"/>
               </w:rPr>
             </w:pPr>
+            <w:r>
+              <w:rPr>
+                <w:b/>
+                <w:bCs/>
+                <w:sz w:val="18"/>
+                <w:szCs w:val="18"/>
+              </w:rPr>
+              <w:t>Mediante la asignatura de Arquitectura de Software, comprendí que el desarrollo de software profesional requiere adoptar una perspectiva visual a través de diagramas o planos. Estos me proporcionan una visión clara de lo que se debe lograr con el sistema. Para alcanzar esta meta, utilicé el conocido modelo de vistas 4+1, el cual complementé con diagramas en lenguaje UML.</w:t>
+            </w:r>
           </w:p>
         </w:tc>
       </w:tr>
@@ -2525,6 +2609,15 @@
                 <w:szCs w:val="18"/>
               </w:rPr>
             </w:pPr>
+            <w:r>
+              <w:rPr>
+                <w:b/>
+                <w:bCs/>
+                <w:sz w:val="18"/>
+                <w:szCs w:val="18"/>
+              </w:rPr>
+              <w:t>Al igual que en el punto 1, en la asignatura de BPM tuve que analizar procesos ya existentes dentro de una organización y, a partir de ello, proporcionar una alternativa conforme a los estándares tecnológicos actuales, tomando en consideración la automatización de dichos procesos.</w:t>
+            </w:r>
           </w:p>
         </w:tc>
       </w:tr>
@@ -2555,7 +2648,17 @@
                 <w:sz w:val="18"/>
                 <w:szCs w:val="18"/>
               </w:rPr>
-              <w:t>Resolver las vulnerabilidades sistémicas para asegurar que el software construido cumple las normas de seguridad exigidas por la industria.</w:t>
+              <w:t xml:space="preserve">Resolver las vulnerabilidades sistémicas para asegurar que el software construido </w:t>
+            </w:r>
+            <w:r>
+              <w:rPr>
+                <w:b/>
+                <w:bCs/>
+                <w:sz w:val="18"/>
+                <w:szCs w:val="18"/>
+              </w:rPr>
+              <w:lastRenderedPageBreak/>
+              <w:t>cumple las normas de seguridad exigidas por la industria.</w:t>
             </w:r>
           </w:p>
         </w:tc>
@@ -2668,6 +2771,25 @@
                 <w:szCs w:val="18"/>
               </w:rPr>
             </w:pPr>
+            <w:r>
+              <w:rPr>
+                <w:b/>
+                <w:bCs/>
+                <w:sz w:val="18"/>
+                <w:szCs w:val="18"/>
+              </w:rPr>
+              <w:t xml:space="preserve">Mediante el uso de herramientas como ZAP y un entorno virtual en Kali Linux, pude comprender los distintos tipos de vulnerabilidades que </w:t>
+            </w:r>
+            <w:r>
+              <w:rPr>
+                <w:b/>
+                <w:bCs/>
+                <w:sz w:val="18"/>
+                <w:szCs w:val="18"/>
+              </w:rPr>
+              <w:lastRenderedPageBreak/>
+              <w:t>puede presentar un sistema tecnológico, tales como la intercepción de peticiones y la inyección SQL, entre otras.</w:t>
+            </w:r>
           </w:p>
         </w:tc>
       </w:tr>
@@ -2698,6 +2820,7 @@
                 <w:sz w:val="18"/>
                 <w:szCs w:val="18"/>
               </w:rPr>
+              <w:lastRenderedPageBreak/>
               <w:t>Gestionar proyectos informáticos, ofreciendo alternativas para la toma de decisiones de acuerdo con los requerimientos de la organización.</w:t>
             </w:r>
           </w:p>
@@ -2811,6 +2934,15 @@
                 <w:szCs w:val="18"/>
               </w:rPr>
             </w:pPr>
+            <w:r>
+              <w:rPr>
+                <w:b/>
+                <w:bCs/>
+                <w:sz w:val="18"/>
+                <w:szCs w:val="18"/>
+              </w:rPr>
+              <w:t>Con asignaturas como Ingeniería de Software, pude profundizar en distintos métodos sobre cómo gestionar un proyecto informático, tanto con metodologías ágiles como tradicionales. De manera complementaria, en Gestión de Proyectos Informáticos aprendí cómo funciona un proyecto desde una perspectiva económica y, por último, cómo gestionar los posibles riesgos estableciendo mitigaciones predefinidas.</w:t>
+            </w:r>
           </w:p>
         </w:tc>
       </w:tr>
@@ -2954,6 +3086,15 @@
                 <w:szCs w:val="18"/>
               </w:rPr>
             </w:pPr>
+            <w:r>
+              <w:rPr>
+                <w:b/>
+                <w:bCs/>
+                <w:sz w:val="18"/>
+                <w:szCs w:val="18"/>
+              </w:rPr>
+              <w:t>"Mediante la asignatura de Inteligencia de Negocios, adquirí el conocimiento de cómo funcionan los procesos ETL, junto a las estructuras de almacenamiento que permiten generar analítica, como los Data Warehouses. Posteriormente, a través de la asignatura de Big Data, potencié este conocimiento aprendiendo a manejar tanto datos estáticos como dinámicos o generados en tiempo real.</w:t>
+            </w:r>
           </w:p>
         </w:tc>
       </w:tr>
@@ -2985,7 +3126,6 @@
                 <w:sz w:val="24"/>
                 <w:szCs w:val="24"/>
               </w:rPr>
-              <w:lastRenderedPageBreak/>
               <w:t xml:space="preserve">Competencias </w:t>
             </w:r>
             <w:r>
@@ -3170,7 +3310,17 @@
                 <w:sz w:val="18"/>
                 <w:szCs w:val="18"/>
               </w:rPr>
-              <w:t>Resolver situaciones problemáticas de la vida cotidiana, educación superior y mundo laboral, utilizando elementos de las matemáticas discretas y relaciones funcionales, de acuerdo con requerimientos.</w:t>
+              <w:t xml:space="preserve">Resolver situaciones problemáticas de la vida cotidiana, educación superior y mundo laboral, utilizando elementos de las matemáticas </w:t>
+            </w:r>
+            <w:r>
+              <w:rPr>
+                <w:b/>
+                <w:bCs/>
+                <w:sz w:val="18"/>
+                <w:szCs w:val="18"/>
+              </w:rPr>
+              <w:lastRenderedPageBreak/>
+              <w:t>discretas y relaciones funcionales, de acuerdo con requerimientos.</w:t>
             </w:r>
           </w:p>
         </w:tc>
@@ -3599,17 +3749,7 @@
                 <w:sz w:val="18"/>
                 <w:szCs w:val="18"/>
               </w:rPr>
-              <w:t xml:space="preserve">Comunicarse de forma oral y escrita usando el idioma inglés en situaciones sociolaborales a un </w:t>
-            </w:r>
-            <w:r>
-              <w:rPr>
-                <w:b/>
-                <w:bCs/>
-                <w:sz w:val="18"/>
-                <w:szCs w:val="18"/>
-              </w:rPr>
-              <w:lastRenderedPageBreak/>
-              <w:t>nivel intermedio, según la Tabla de Competencias TOEIC y CEFR.</w:t>
+              <w:t>Comunicarse de forma oral y escrita usando el idioma inglés en situaciones sociolaborales a un nivel intermedio, según la Tabla de Competencias TOEIC y CEFR.</w:t>
             </w:r>
           </w:p>
         </w:tc>
@@ -3635,7 +3775,6 @@
                 <w:sz w:val="28"/>
                 <w:szCs w:val="28"/>
               </w:rPr>
-              <w:lastRenderedPageBreak/>
               <w:t>x</w:t>
             </w:r>
           </w:p>
@@ -4039,7 +4178,17 @@
                 <w:sz w:val="18"/>
                 <w:szCs w:val="18"/>
               </w:rPr>
-              <w:t>Elaborar proyectos innovadores que agreguen valor a contextos sociales y productivos, de acuerdo con las necesidades del entorno.</w:t>
+              <w:t xml:space="preserve">Elaborar proyectos innovadores que agreguen valor a </w:t>
+            </w:r>
+            <w:r>
+              <w:rPr>
+                <w:b/>
+                <w:bCs/>
+                <w:sz w:val="18"/>
+                <w:szCs w:val="18"/>
+              </w:rPr>
+              <w:lastRenderedPageBreak/>
+              <w:t>contextos sociales y productivos, de acuerdo con las necesidades del entorno.</w:t>
             </w:r>
           </w:p>
         </w:tc>
@@ -10434,7 +10583,6 @@
   <w:style w:type="character" w:default="1" w:styleId="Fuentedeprrafopredeter">
     <w:name w:val="Default Paragraph Font"/>
     <w:uiPriority w:val="1"/>
-    <w:semiHidden/>
     <w:unhideWhenUsed/>
   </w:style>
   <w:style w:type="table" w:default="1" w:styleId="Tablanormal">
@@ -11735,7 +11883,9 @@
 </file>
 
 <file path=customXml/item1.xml><?xml version="1.0" encoding="utf-8"?>
-<b:Sources xmlns:b="http://schemas.openxmlformats.org/officeDocument/2006/bibliography" xmlns="http://schemas.openxmlformats.org/officeDocument/2006/bibliography" SelectedStyle="\APASixthEditionOfficeOnline.xsl" StyleName="APA" Version="6"/>
+<p:properties xmlns:p="http://schemas.microsoft.com/office/2006/metadata/properties" xmlns:xsi="http://www.w3.org/2001/XMLSchema-instance" xmlns:pc="http://schemas.microsoft.com/office/infopath/2007/PartnerControls">
+  <documentManagement/>
+</p:properties>
 </file>
 
 <file path=customXml/item2.xml><?xml version="1.0" encoding="utf-8"?>
@@ -11871,9 +12021,7 @@
 </file>
 
 <file path=customXml/item3.xml><?xml version="1.0" encoding="utf-8"?>
-<p:properties xmlns:p="http://schemas.microsoft.com/office/2006/metadata/properties" xmlns:xsi="http://www.w3.org/2001/XMLSchema-instance" xmlns:pc="http://schemas.microsoft.com/office/infopath/2007/PartnerControls">
-  <documentManagement/>
-</p:properties>
+<b:Sources xmlns:b="http://schemas.openxmlformats.org/officeDocument/2006/bibliography" xmlns="http://schemas.openxmlformats.org/officeDocument/2006/bibliography" SelectedStyle="\APASixthEditionOfficeOnline.xsl" StyleName="APA" Version="6"/>
 </file>
 
 <file path=customXml/item4.xml><?xml version="1.0" encoding="utf-8"?>
@@ -11886,9 +12034,10 @@
 </file>
 
 <file path=customXml/itemProps1.xml><?xml version="1.0" encoding="utf-8"?>
-<ds:datastoreItem xmlns:ds="http://schemas.openxmlformats.org/officeDocument/2006/customXml" ds:itemID="{6E8A10B9-B765-4F0B-A47F-7CB788CD8F65}">
+<ds:datastoreItem xmlns:ds="http://schemas.openxmlformats.org/officeDocument/2006/customXml" ds:itemID="{5F1783E3-BA1C-4CA3-8E32-C9B378BBED03}">
   <ds:schemaRefs>
-    <ds:schemaRef ds:uri="http://schemas.openxmlformats.org/officeDocument/2006/bibliography"/>
+    <ds:schemaRef ds:uri="http://schemas.microsoft.com/office/2006/metadata/properties"/>
+    <ds:schemaRef ds:uri="http://schemas.microsoft.com/office/infopath/2007/PartnerControls"/>
   </ds:schemaRefs>
 </ds:datastoreItem>
 </file>
@@ -11912,10 +12061,9 @@
 </file>
 
 <file path=customXml/itemProps3.xml><?xml version="1.0" encoding="utf-8"?>
-<ds:datastoreItem xmlns:ds="http://schemas.openxmlformats.org/officeDocument/2006/customXml" ds:itemID="{5F1783E3-BA1C-4CA3-8E32-C9B378BBED03}">
+<ds:datastoreItem xmlns:ds="http://schemas.openxmlformats.org/officeDocument/2006/customXml" ds:itemID="{6E8A10B9-B765-4F0B-A47F-7CB788CD8F65}">
   <ds:schemaRefs>
-    <ds:schemaRef ds:uri="http://schemas.microsoft.com/office/2006/metadata/properties"/>
-    <ds:schemaRef ds:uri="http://schemas.microsoft.com/office/infopath/2007/PartnerControls"/>
+    <ds:schemaRef ds:uri="http://schemas.openxmlformats.org/officeDocument/2006/bibliography"/>
   </ds:schemaRefs>
 </ds:datastoreItem>
 </file>

</xml_diff>

<commit_message>
termino de reflexión benjamin n
</commit_message>
<xml_diff>
--- a/Experiencia_1 - Planificación de proyecto/Actividad-1 - Autoevaluaciones_Grupo2/1.1_APT122_AutoevaluacionCompetenciasFase1 - benjamin nunez.docx
+++ b/Experiencia_1 - Planificación de proyecto/Actividad-1 - Autoevaluaciones_Grupo2/1.1_APT122_AutoevaluacionCompetenciasFase1 - benjamin nunez.docx
@@ -938,6 +938,15 @@
                 <w:szCs w:val="24"/>
               </w:rPr>
             </w:pPr>
+            <w:r>
+              <w:rPr>
+                <w:rFonts w:eastAsiaTheme="majorEastAsia"/>
+                <w:color w:val="767171" w:themeColor="background2" w:themeShade="80"/>
+                <w:sz w:val="24"/>
+                <w:szCs w:val="24"/>
+              </w:rPr>
+              <w:t>Estudio Tradicional (por mientras)</w:t>
+            </w:r>
           </w:p>
         </w:tc>
       </w:tr>
@@ -1834,7 +1843,27 @@
                 <w:sz w:val="18"/>
                 <w:szCs w:val="18"/>
               </w:rPr>
-              <w:t>Puedo decir que poseo conocimientos relacionados con el modelado de bases de datos, así como del modelo entidad-relación necesario para su correcto funcionamiento. Este aprendizaje fue mi punto de partida para adentrarme en el manejo de datos mediante Oracle Data Modeler.</w:t>
+              <w:t xml:space="preserve">Puedo decir que poseo conocimientos relacionados con el modelado de bases de datos, así como del modelo entidad-relación necesario para su correcto funcionamiento. Este aprendizaje fue mi punto de partida para adentrarme en el manejo de datos mediante Oracle Data </w:t>
+            </w:r>
+            <w:proofErr w:type="spellStart"/>
+            <w:r>
+              <w:rPr>
+                <w:b/>
+                <w:bCs/>
+                <w:sz w:val="18"/>
+                <w:szCs w:val="18"/>
+              </w:rPr>
+              <w:t>Modeler</w:t>
+            </w:r>
+            <w:proofErr w:type="spellEnd"/>
+            <w:r>
+              <w:rPr>
+                <w:b/>
+                <w:bCs/>
+                <w:sz w:val="18"/>
+                <w:szCs w:val="18"/>
+              </w:rPr>
+              <w:t>.</w:t>
             </w:r>
           </w:p>
         </w:tc>
@@ -3093,7 +3122,27 @@
                 <w:sz w:val="18"/>
                 <w:szCs w:val="18"/>
               </w:rPr>
-              <w:t>"Mediante la asignatura de Inteligencia de Negocios, adquirí el conocimiento de cómo funcionan los procesos ETL, junto a las estructuras de almacenamiento que permiten generar analítica, como los Data Warehouses. Posteriormente, a través de la asignatura de Big Data, potencié este conocimiento aprendiendo a manejar tanto datos estáticos como dinámicos o generados en tiempo real.</w:t>
+              <w:t xml:space="preserve">"Mediante la asignatura de Inteligencia de Negocios, adquirí el conocimiento de cómo funcionan los procesos ETL, junto a las estructuras de almacenamiento que permiten generar analítica, como los Data </w:t>
+            </w:r>
+            <w:proofErr w:type="spellStart"/>
+            <w:r>
+              <w:rPr>
+                <w:b/>
+                <w:bCs/>
+                <w:sz w:val="18"/>
+                <w:szCs w:val="18"/>
+              </w:rPr>
+              <w:t>Warehouses</w:t>
+            </w:r>
+            <w:proofErr w:type="spellEnd"/>
+            <w:r>
+              <w:rPr>
+                <w:b/>
+                <w:bCs/>
+                <w:sz w:val="18"/>
+                <w:szCs w:val="18"/>
+              </w:rPr>
+              <w:t>. Posteriormente, a través de la asignatura de Big Data, potencié este conocimiento aprendiendo a manejar tanto datos estáticos como dinámicos o generados en tiempo real.</w:t>
             </w:r>
           </w:p>
         </w:tc>
@@ -3280,6 +3329,15 @@
                 <w:szCs w:val="18"/>
               </w:rPr>
             </w:pPr>
+            <w:r>
+              <w:rPr>
+                <w:b/>
+                <w:bCs/>
+                <w:sz w:val="18"/>
+                <w:szCs w:val="18"/>
+              </w:rPr>
+              <w:t>A lo largo de mi formación, he superado diversos niveles de matemáticas, comenzando con cursos de nivelación hasta llegar a materias más complejas como estadística descriptiva. Cuento con las bases necesarias para desenvolverme en esta área sin problemas, aunque soy consciente de que mi mayor especialidad reside en otras áreas tecnológicas.</w:t>
+            </w:r>
           </w:p>
         </w:tc>
       </w:tr>
@@ -3356,23 +3414,6 @@
                 <w:szCs w:val="18"/>
               </w:rPr>
             </w:pPr>
-          </w:p>
-        </w:tc>
-        <w:tc>
-          <w:tcPr>
-            <w:tcW w:w="1055" w:type="dxa"/>
-            <w:vAlign w:val="center"/>
-          </w:tcPr>
-          <w:p>
-            <w:pPr>
-              <w:jc w:val="center"/>
-              <w:rPr>
-                <w:b/>
-                <w:bCs/>
-                <w:sz w:val="18"/>
-                <w:szCs w:val="18"/>
-              </w:rPr>
-            </w:pPr>
             <w:r>
               <w:rPr>
                 <w:b/>
@@ -3386,6 +3427,23 @@
         </w:tc>
         <w:tc>
           <w:tcPr>
+            <w:tcW w:w="1055" w:type="dxa"/>
+            <w:vAlign w:val="center"/>
+          </w:tcPr>
+          <w:p>
+            <w:pPr>
+              <w:jc w:val="center"/>
+              <w:rPr>
+                <w:b/>
+                <w:bCs/>
+                <w:sz w:val="18"/>
+                <w:szCs w:val="18"/>
+              </w:rPr>
+            </w:pPr>
+          </w:p>
+        </w:tc>
+        <w:tc>
+          <w:tcPr>
             <w:tcW w:w="1187" w:type="dxa"/>
             <w:vAlign w:val="center"/>
           </w:tcPr>
@@ -3433,6 +3491,25 @@
                 <w:szCs w:val="18"/>
               </w:rPr>
             </w:pPr>
+            <w:r>
+              <w:rPr>
+                <w:b/>
+                <w:bCs/>
+                <w:sz w:val="18"/>
+                <w:szCs w:val="18"/>
+              </w:rPr>
+              <w:t xml:space="preserve">Continuando con lo señalado anteriormente, he experimentado con la creación de funciones utilizando lenguajes como Python, además de trabajar con el </w:t>
+            </w:r>
+            <w:r>
+              <w:rPr>
+                <w:b/>
+                <w:bCs/>
+                <w:sz w:val="18"/>
+                <w:szCs w:val="18"/>
+              </w:rPr>
+              <w:lastRenderedPageBreak/>
+              <w:t>manejo de matrices, entre otros aspectos.</w:t>
+            </w:r>
           </w:p>
         </w:tc>
       </w:tr>
@@ -3463,6 +3540,7 @@
                 <w:sz w:val="18"/>
                 <w:szCs w:val="18"/>
               </w:rPr>
+              <w:lastRenderedPageBreak/>
               <w:t>Resolver situaciones problemáticas de la educación superior y mundo laboral, utilizando elementos de la estadística descriptiva, de acuerdo con requerimientos.</w:t>
             </w:r>
           </w:p>
@@ -3576,6 +3654,26 @@
                 <w:szCs w:val="18"/>
               </w:rPr>
             </w:pPr>
+            <w:proofErr w:type="gramStart"/>
+            <w:r>
+              <w:rPr>
+                <w:b/>
+                <w:bCs/>
+                <w:sz w:val="18"/>
+                <w:szCs w:val="18"/>
+              </w:rPr>
+              <w:t>Y</w:t>
+            </w:r>
+            <w:proofErr w:type="gramEnd"/>
+            <w:r>
+              <w:rPr>
+                <w:b/>
+                <w:bCs/>
+                <w:sz w:val="18"/>
+                <w:szCs w:val="18"/>
+              </w:rPr>
+              <w:t xml:space="preserve"> por último, poseo conocimientos para realizar visualizaciones de datos estadísticos mediante Excel, además de nociones básicas de minería de datos. En este proceso, aplico fundamentos como la moda, la mediana, la desviación estándar y la selección del tipo de gráfico adecuado.</w:t>
+            </w:r>
           </w:p>
         </w:tc>
       </w:tr>
@@ -3719,6 +3817,15 @@
                 <w:szCs w:val="18"/>
               </w:rPr>
             </w:pPr>
+            <w:r>
+              <w:rPr>
+                <w:b/>
+                <w:bCs/>
+                <w:sz w:val="18"/>
+                <w:szCs w:val="18"/>
+              </w:rPr>
+              <w:t>A lo largo de estos cuatro años de formación, he desarrollado habilidades de comunicación efectiva. Mi capacidad para transmitir ideas de forma clara se evidencia en las diversas presentaciones de proyectos que he estructurado y defendido con éxito.</w:t>
+            </w:r>
           </w:p>
         </w:tc>
       </w:tr>
@@ -3862,6 +3969,15 @@
                 <w:szCs w:val="18"/>
               </w:rPr>
             </w:pPr>
+            <w:r>
+              <w:rPr>
+                <w:b/>
+                <w:bCs/>
+                <w:sz w:val="18"/>
+                <w:szCs w:val="18"/>
+              </w:rPr>
+              <w:t>Tengo la habilidad de establecer una comunicación formal en inglés con otros colaboradores o superiores. Como respaldo, en el examen TOEIC obtuve un total de 890 puntos.</w:t>
+            </w:r>
           </w:p>
         </w:tc>
       </w:tr>
@@ -4005,6 +4121,177 @@
                 <w:szCs w:val="18"/>
               </w:rPr>
             </w:pPr>
+            <w:r>
+              <w:rPr>
+                <w:b/>
+                <w:bCs/>
+                <w:sz w:val="18"/>
+                <w:szCs w:val="18"/>
+              </w:rPr>
+              <w:t>Tengo la habilidad de establecer una comunicación formal en inglés con otros colaboradores o superiores. Como respaldo, en el examen TOEIC obtuve un total de 890 puntos.</w:t>
+            </w:r>
+          </w:p>
+        </w:tc>
+      </w:tr>
+      <w:tr>
+        <w:trPr>
+          <w:trHeight w:val="494"/>
+          <w:jc w:val="center"/>
+        </w:trPr>
+        <w:tc>
+          <w:tcPr>
+            <w:tcW w:w="1931" w:type="dxa"/>
+            <w:vAlign w:val="center"/>
+          </w:tcPr>
+          <w:p>
+            <w:pPr>
+              <w:jc w:val="center"/>
+              <w:rPr>
+                <w:b/>
+                <w:bCs/>
+                <w:sz w:val="18"/>
+                <w:szCs w:val="18"/>
+              </w:rPr>
+            </w:pPr>
+            <w:r>
+              <w:rPr>
+                <w:b/>
+                <w:bCs/>
+                <w:sz w:val="18"/>
+                <w:szCs w:val="18"/>
+              </w:rPr>
+              <w:t>Desarrollar la propia habilidad emprendedora, a través de experiencias en el ámbito de la especialidad.</w:t>
+            </w:r>
+          </w:p>
+        </w:tc>
+        <w:tc>
+          <w:tcPr>
+            <w:tcW w:w="1017" w:type="dxa"/>
+            <w:vAlign w:val="center"/>
+          </w:tcPr>
+          <w:p>
+            <w:pPr>
+              <w:jc w:val="center"/>
+              <w:rPr>
+                <w:b/>
+                <w:bCs/>
+                <w:sz w:val="18"/>
+                <w:szCs w:val="18"/>
+              </w:rPr>
+            </w:pPr>
+          </w:p>
+        </w:tc>
+        <w:tc>
+          <w:tcPr>
+            <w:tcW w:w="926" w:type="dxa"/>
+            <w:vAlign w:val="center"/>
+          </w:tcPr>
+          <w:p>
+            <w:pPr>
+              <w:jc w:val="center"/>
+              <w:rPr>
+                <w:b/>
+                <w:bCs/>
+                <w:sz w:val="18"/>
+                <w:szCs w:val="18"/>
+              </w:rPr>
+            </w:pPr>
+          </w:p>
+        </w:tc>
+        <w:tc>
+          <w:tcPr>
+            <w:tcW w:w="1055" w:type="dxa"/>
+            <w:vAlign w:val="center"/>
+          </w:tcPr>
+          <w:p>
+            <w:pPr>
+              <w:jc w:val="center"/>
+              <w:rPr>
+                <w:b/>
+                <w:bCs/>
+                <w:sz w:val="18"/>
+                <w:szCs w:val="18"/>
+              </w:rPr>
+            </w:pPr>
+            <w:r>
+              <w:rPr>
+                <w:b/>
+                <w:bCs/>
+                <w:sz w:val="28"/>
+                <w:szCs w:val="28"/>
+              </w:rPr>
+              <w:t>x</w:t>
+            </w:r>
+          </w:p>
+        </w:tc>
+        <w:tc>
+          <w:tcPr>
+            <w:tcW w:w="1187" w:type="dxa"/>
+            <w:vAlign w:val="center"/>
+          </w:tcPr>
+          <w:p>
+            <w:pPr>
+              <w:jc w:val="center"/>
+              <w:rPr>
+                <w:b/>
+                <w:bCs/>
+                <w:sz w:val="18"/>
+                <w:szCs w:val="18"/>
+              </w:rPr>
+            </w:pPr>
+          </w:p>
+        </w:tc>
+        <w:tc>
+          <w:tcPr>
+            <w:tcW w:w="1250" w:type="dxa"/>
+            <w:vAlign w:val="center"/>
+          </w:tcPr>
+          <w:p>
+            <w:pPr>
+              <w:jc w:val="center"/>
+              <w:rPr>
+                <w:b/>
+                <w:bCs/>
+                <w:sz w:val="18"/>
+                <w:szCs w:val="18"/>
+              </w:rPr>
+            </w:pPr>
+          </w:p>
+        </w:tc>
+        <w:tc>
+          <w:tcPr>
+            <w:tcW w:w="2557" w:type="dxa"/>
+            <w:vAlign w:val="center"/>
+          </w:tcPr>
+          <w:p>
+            <w:pPr>
+              <w:jc w:val="center"/>
+              <w:rPr>
+                <w:b/>
+                <w:bCs/>
+                <w:sz w:val="18"/>
+                <w:szCs w:val="18"/>
+              </w:rPr>
+            </w:pPr>
+            <w:r>
+              <w:rPr>
+                <w:b/>
+                <w:bCs/>
+                <w:sz w:val="18"/>
+                <w:szCs w:val="18"/>
+              </w:rPr>
+              <w:t xml:space="preserve">He podido generar y estructurar ideas viables para un emprendimiento, lo cual quedó reflejado en mi desempeño en la asignatura de Mentalidad Emprendedora. Sin embargo, soy consciente de </w:t>
+            </w:r>
+            <w:r>
+              <w:rPr>
+                <w:b/>
+                <w:bCs/>
+                <w:sz w:val="18"/>
+                <w:szCs w:val="18"/>
+              </w:rPr>
+              <w:lastRenderedPageBreak/>
+              <w:t>que en el mundo real esto es un reto mayor, ya que la mayoría de los problemas parecen tener soluciones ya existentes en el mercado.</w:t>
+            </w:r>
           </w:p>
         </w:tc>
       </w:tr>
@@ -4035,7 +4322,8 @@
                 <w:sz w:val="18"/>
                 <w:szCs w:val="18"/>
               </w:rPr>
-              <w:t>Desarrollar la propia habilidad emprendedora, a través de experiencias en el ámbito de la especialidad.</w:t>
+              <w:lastRenderedPageBreak/>
+              <w:t>Elaborar proyectos innovadores que agreguen valor a contextos sociales y productivos, de acuerdo con las necesidades del entorno.</w:t>
             </w:r>
           </w:p>
         </w:tc>
@@ -4148,6 +4436,15 @@
                 <w:szCs w:val="18"/>
               </w:rPr>
             </w:pPr>
+            <w:r>
+              <w:rPr>
+                <w:b/>
+                <w:bCs/>
+                <w:sz w:val="18"/>
+                <w:szCs w:val="18"/>
+              </w:rPr>
+              <w:t>Como describí anteriormente, aunque no puedo decir que mi propuesta comparta características con proyectos ya existentes, de alguna manera logra resolver una problemática que otros no han podido abarcar, lo cual considero un avance considerable.</w:t>
+            </w:r>
           </w:p>
         </w:tc>
       </w:tr>
@@ -4178,17 +4475,7 @@
                 <w:sz w:val="18"/>
                 <w:szCs w:val="18"/>
               </w:rPr>
-              <w:t xml:space="preserve">Elaborar proyectos innovadores que agreguen valor a </w:t>
-            </w:r>
-            <w:r>
-              <w:rPr>
-                <w:b/>
-                <w:bCs/>
-                <w:sz w:val="18"/>
-                <w:szCs w:val="18"/>
-              </w:rPr>
-              <w:lastRenderedPageBreak/>
-              <w:t>contextos sociales y productivos, de acuerdo con las necesidades del entorno.</w:t>
+              <w:t>Reconocer un desempeño correcto en situaciones de la profesión o especialidad en el área de la informática.</w:t>
             </w:r>
           </w:p>
         </w:tc>
@@ -4301,29 +4588,6 @@
                 <w:szCs w:val="18"/>
               </w:rPr>
             </w:pPr>
-          </w:p>
-        </w:tc>
-      </w:tr>
-      <w:tr>
-        <w:trPr>
-          <w:trHeight w:val="576"/>
-          <w:jc w:val="center"/>
-        </w:trPr>
-        <w:tc>
-          <w:tcPr>
-            <w:tcW w:w="1931" w:type="dxa"/>
-            <w:vAlign w:val="center"/>
-          </w:tcPr>
-          <w:p>
-            <w:pPr>
-              <w:jc w:val="center"/>
-              <w:rPr>
-                <w:b/>
-                <w:bCs/>
-                <w:sz w:val="18"/>
-                <w:szCs w:val="18"/>
-              </w:rPr>
-            </w:pPr>
             <w:r>
               <w:rPr>
                 <w:b/>
@@ -4331,119 +4595,8 @@
                 <w:sz w:val="18"/>
                 <w:szCs w:val="18"/>
               </w:rPr>
-              <w:t>Reconocer un desempeño correcto en situaciones de la profesión o especialidad en el área de la informática.</w:t>
+              <w:t>Si bien aún me encuentro en busca de mi primera experiencia profesional en la industria, mi trayectoria académica ha sido muy positiva y constante. Actualmente curso mi último semestre de carrera, con las bases necesarias para llevar mis conocimientos al mundo laboral.</w:t>
             </w:r>
-          </w:p>
-        </w:tc>
-        <w:tc>
-          <w:tcPr>
-            <w:tcW w:w="1017" w:type="dxa"/>
-            <w:vAlign w:val="center"/>
-          </w:tcPr>
-          <w:p>
-            <w:pPr>
-              <w:jc w:val="center"/>
-              <w:rPr>
-                <w:b/>
-                <w:bCs/>
-                <w:sz w:val="18"/>
-                <w:szCs w:val="18"/>
-              </w:rPr>
-            </w:pPr>
-          </w:p>
-        </w:tc>
-        <w:tc>
-          <w:tcPr>
-            <w:tcW w:w="926" w:type="dxa"/>
-            <w:vAlign w:val="center"/>
-          </w:tcPr>
-          <w:p>
-            <w:pPr>
-              <w:jc w:val="center"/>
-              <w:rPr>
-                <w:b/>
-                <w:bCs/>
-                <w:sz w:val="18"/>
-                <w:szCs w:val="18"/>
-              </w:rPr>
-            </w:pPr>
-            <w:r>
-              <w:rPr>
-                <w:b/>
-                <w:bCs/>
-                <w:sz w:val="28"/>
-                <w:szCs w:val="28"/>
-              </w:rPr>
-              <w:t>x</w:t>
-            </w:r>
-          </w:p>
-        </w:tc>
-        <w:tc>
-          <w:tcPr>
-            <w:tcW w:w="1055" w:type="dxa"/>
-            <w:vAlign w:val="center"/>
-          </w:tcPr>
-          <w:p>
-            <w:pPr>
-              <w:jc w:val="center"/>
-              <w:rPr>
-                <w:b/>
-                <w:bCs/>
-                <w:sz w:val="18"/>
-                <w:szCs w:val="18"/>
-              </w:rPr>
-            </w:pPr>
-          </w:p>
-        </w:tc>
-        <w:tc>
-          <w:tcPr>
-            <w:tcW w:w="1187" w:type="dxa"/>
-            <w:vAlign w:val="center"/>
-          </w:tcPr>
-          <w:p>
-            <w:pPr>
-              <w:jc w:val="center"/>
-              <w:rPr>
-                <w:b/>
-                <w:bCs/>
-                <w:sz w:val="18"/>
-                <w:szCs w:val="18"/>
-              </w:rPr>
-            </w:pPr>
-          </w:p>
-        </w:tc>
-        <w:tc>
-          <w:tcPr>
-            <w:tcW w:w="1250" w:type="dxa"/>
-            <w:vAlign w:val="center"/>
-          </w:tcPr>
-          <w:p>
-            <w:pPr>
-              <w:jc w:val="center"/>
-              <w:rPr>
-                <w:b/>
-                <w:bCs/>
-                <w:sz w:val="18"/>
-                <w:szCs w:val="18"/>
-              </w:rPr>
-            </w:pPr>
-          </w:p>
-        </w:tc>
-        <w:tc>
-          <w:tcPr>
-            <w:tcW w:w="2557" w:type="dxa"/>
-            <w:vAlign w:val="center"/>
-          </w:tcPr>
-          <w:p>
-            <w:pPr>
-              <w:jc w:val="center"/>
-              <w:rPr>
-                <w:b/>
-                <w:bCs/>
-                <w:sz w:val="18"/>
-                <w:szCs w:val="18"/>
-              </w:rPr>
-            </w:pPr>
           </w:p>
         </w:tc>
       </w:tr>
@@ -11883,12 +12036,6 @@
 </file>
 
 <file path=customXml/item1.xml><?xml version="1.0" encoding="utf-8"?>
-<p:properties xmlns:p="http://schemas.microsoft.com/office/2006/metadata/properties" xmlns:xsi="http://www.w3.org/2001/XMLSchema-instance" xmlns:pc="http://schemas.microsoft.com/office/infopath/2007/PartnerControls">
-  <documentManagement/>
-</p:properties>
-</file>
-
-<file path=customXml/item2.xml><?xml version="1.0" encoding="utf-8"?>
 <ct:contentTypeSchema xmlns:ct="http://schemas.microsoft.com/office/2006/metadata/contentType" xmlns:ma="http://schemas.microsoft.com/office/2006/metadata/properties/metaAttributes" ct:_="" ma:_="" ma:contentTypeName="Documento" ma:contentTypeID="0x010100E96778489EE7714D8BD12CC105EB918B" ma:contentTypeVersion="2" ma:contentTypeDescription="Crear nuevo documento." ma:contentTypeScope="" ma:versionID="416c5c7ae9b5d54d83875cd3c65194e3">
   <xsd:schema xmlns:xsd="http://www.w3.org/2001/XMLSchema" xmlns:xs="http://www.w3.org/2001/XMLSchema" xmlns:p="http://schemas.microsoft.com/office/2006/metadata/properties" xmlns:ns2="126e8a1c-9ea9-435a-ac89-d06c80d62e30" targetNamespace="http://schemas.microsoft.com/office/2006/metadata/properties" ma:root="true" ma:fieldsID="70a237c842677bd850644f8595079f5e" ns2:_="">
     <xsd:import namespace="126e8a1c-9ea9-435a-ac89-d06c80d62e30"/>
@@ -12020,11 +12167,13 @@
 </ct:contentTypeSchema>
 </file>
 
-<file path=customXml/item3.xml><?xml version="1.0" encoding="utf-8"?>
-<b:Sources xmlns:b="http://schemas.openxmlformats.org/officeDocument/2006/bibliography" xmlns="http://schemas.openxmlformats.org/officeDocument/2006/bibliography" SelectedStyle="\APASixthEditionOfficeOnline.xsl" StyleName="APA" Version="6"/>
+<file path=customXml/item2.xml><?xml version="1.0" encoding="utf-8"?>
+<p:properties xmlns:p="http://schemas.microsoft.com/office/2006/metadata/properties" xmlns:xsi="http://www.w3.org/2001/XMLSchema-instance" xmlns:pc="http://schemas.microsoft.com/office/infopath/2007/PartnerControls">
+  <documentManagement/>
+</p:properties>
 </file>
 
-<file path=customXml/item4.xml><?xml version="1.0" encoding="utf-8"?>
+<file path=customXml/item3.xml><?xml version="1.0" encoding="utf-8"?>
 <?mso-contentType ?>
 <FormTemplates xmlns="http://schemas.microsoft.com/sharepoint/v3/contenttype/forms">
   <Display>DocumentLibraryForm</Display>
@@ -12033,16 +12182,11 @@
 </FormTemplates>
 </file>
 
-<file path=customXml/itemProps1.xml><?xml version="1.0" encoding="utf-8"?>
-<ds:datastoreItem xmlns:ds="http://schemas.openxmlformats.org/officeDocument/2006/customXml" ds:itemID="{5F1783E3-BA1C-4CA3-8E32-C9B378BBED03}">
-  <ds:schemaRefs>
-    <ds:schemaRef ds:uri="http://schemas.microsoft.com/office/2006/metadata/properties"/>
-    <ds:schemaRef ds:uri="http://schemas.microsoft.com/office/infopath/2007/PartnerControls"/>
-  </ds:schemaRefs>
-</ds:datastoreItem>
+<file path=customXml/item4.xml><?xml version="1.0" encoding="utf-8"?>
+<b:Sources xmlns:b="http://schemas.openxmlformats.org/officeDocument/2006/bibliography" xmlns="http://schemas.openxmlformats.org/officeDocument/2006/bibliography" SelectedStyle="\APASixthEditionOfficeOnline.xsl" StyleName="APA" Version="6"/>
 </file>
 
-<file path=customXml/itemProps2.xml><?xml version="1.0" encoding="utf-8"?>
+<file path=customXml/itemProps1.xml><?xml version="1.0" encoding="utf-8"?>
 <ds:datastoreItem xmlns:ds="http://schemas.openxmlformats.org/officeDocument/2006/customXml" ds:itemID="{767CD2D5-7A6C-47C3-9B54-C4225C74DD0B}">
   <ds:schemaRefs>
     <ds:schemaRef ds:uri="http://schemas.microsoft.com/office/2006/metadata/contentType"/>
@@ -12060,18 +12204,27 @@
 </ds:datastoreItem>
 </file>
 
+<file path=customXml/itemProps2.xml><?xml version="1.0" encoding="utf-8"?>
+<ds:datastoreItem xmlns:ds="http://schemas.openxmlformats.org/officeDocument/2006/customXml" ds:itemID="{5F1783E3-BA1C-4CA3-8E32-C9B378BBED03}">
+  <ds:schemaRefs>
+    <ds:schemaRef ds:uri="http://schemas.microsoft.com/office/2006/metadata/properties"/>
+    <ds:schemaRef ds:uri="http://schemas.microsoft.com/office/infopath/2007/PartnerControls"/>
+  </ds:schemaRefs>
+</ds:datastoreItem>
+</file>
+
 <file path=customXml/itemProps3.xml><?xml version="1.0" encoding="utf-8"?>
+<ds:datastoreItem xmlns:ds="http://schemas.openxmlformats.org/officeDocument/2006/customXml" ds:itemID="{DABAA964-10BA-4DBC-ABF2-CDEAC0FAF7AA}">
+  <ds:schemaRefs>
+    <ds:schemaRef ds:uri="http://schemas.microsoft.com/sharepoint/v3/contenttype/forms"/>
+  </ds:schemaRefs>
+</ds:datastoreItem>
+</file>
+
+<file path=customXml/itemProps4.xml><?xml version="1.0" encoding="utf-8"?>
 <ds:datastoreItem xmlns:ds="http://schemas.openxmlformats.org/officeDocument/2006/customXml" ds:itemID="{6E8A10B9-B765-4F0B-A47F-7CB788CD8F65}">
   <ds:schemaRefs>
     <ds:schemaRef ds:uri="http://schemas.openxmlformats.org/officeDocument/2006/bibliography"/>
   </ds:schemaRefs>
 </ds:datastoreItem>
-</file>
-
-<file path=customXml/itemProps4.xml><?xml version="1.0" encoding="utf-8"?>
-<ds:datastoreItem xmlns:ds="http://schemas.openxmlformats.org/officeDocument/2006/customXml" ds:itemID="{DABAA964-10BA-4DBC-ABF2-CDEAC0FAF7AA}">
-  <ds:schemaRefs>
-    <ds:schemaRef ds:uri="http://schemas.microsoft.com/sharepoint/v3/contenttype/forms"/>
-  </ds:schemaRefs>
-</ds:datastoreItem>
 </file>
</xml_diff>